<commit_message>
Update Test Cases – Order Form (mobilnemasaze.eu) TC-001 to TC-020 with priorities, severities, entry and exit criteria
</commit_message>
<xml_diff>
--- a/02_TestCases/Test Cases – Order Form.docx
+++ b/02_TestCases/Test Cases – Order Form.docx
@@ -75,6 +75,97 @@
           <w:rtl w:val="0"/>
         </w:rPr>
         <w:t xml:space="preserve">TC-001: Úspešné odoslanie objednávky so všetkými správne vyplnenými poľami (Happy Path)</w:t>
+      </w:r>
+    </w:p>
+    <w:p>
+      <w:pPr>
+        <w:rPr/>
+      </w:pPr>
+      <w:r>
+        <w:rPr>
+          <w:rtl w:val="0"/>
+        </w:rPr>
+      </w:r>
+    </w:p>
+    <w:p>
+      <w:pPr>
+        <w:rPr/>
+      </w:pPr>
+      <w:r>
+        <w:rPr>
+          <w:b w:val="1"/>
+          <w:bCs w:val="1"/>
+          <w:rtl w:val="0"/>
+        </w:rPr>
+        <w:t xml:space="preserve">Entry Criteria:</w:t>
+      </w:r>
+      <w:r>
+        <w:rPr>
+          <w:rtl w:val="0"/>
+        </w:rPr>
+        <w:t xml:space="preserve"> Web je dostupný, objednávkový formulár viditeľný</w:t>
+      </w:r>
+    </w:p>
+    <w:p>
+      <w:pPr>
+        <w:rPr/>
+      </w:pPr>
+      <w:r>
+        <w:rPr>
+          <w:b w:val="1"/>
+          <w:bCs w:val="1"/>
+          <w:rtl w:val="0"/>
+        </w:rPr>
+        <w:t xml:space="preserve">Exit Criteria:</w:t>
+      </w:r>
+      <w:r>
+        <w:rPr>
+          <w:rtl w:val="0"/>
+        </w:rPr>
+        <w:t xml:space="preserve"> Popup potvrdzujúci objednávku sa zobrazil</w:t>
+      </w:r>
+    </w:p>
+    <w:p>
+      <w:pPr>
+        <w:rPr/>
+      </w:pPr>
+      <w:r>
+        <w:rPr>
+          <w:b w:val="1"/>
+          <w:bCs w:val="1"/>
+          <w:rtl w:val="0"/>
+        </w:rPr>
+        <w:t xml:space="preserve">Severity:</w:t>
+      </w:r>
+      <w:r>
+        <w:rPr>
+          <w:rtl w:val="0"/>
+        </w:rPr>
+        <w:t xml:space="preserve"> Critical</w:t>
+      </w:r>
+    </w:p>
+    <w:p>
+      <w:pPr>
+        <w:rPr/>
+      </w:pPr>
+      <w:r>
+        <w:rPr>
+          <w:b w:val="1"/>
+          <w:bCs w:val="1"/>
+          <w:rtl w:val="0"/>
+        </w:rPr>
+        <w:t xml:space="preserve">Priority:</w:t>
+      </w:r>
+      <w:r>
+        <w:rPr>
+          <w:rtl w:val="0"/>
+        </w:rPr>
+        <w:t xml:space="preserve"> High</w:t>
+      </w:r>
+      <w:r>
+        <w:rPr>
+          <w:rtl w:val="0"/>
+        </w:rPr>
       </w:r>
     </w:p>
     <w:p>
@@ -461,338 +552,8 @@
           <w:szCs w:val="26"/>
         </w:rPr>
       </w:pPr>
-      <w:bookmarkStart w:colFirst="0" w:colLast="0" w:name="_z4eo8m4o897n" w:id="2"/>
+      <w:bookmarkStart w:colFirst="0" w:colLast="0" w:name="_gjue1lx8q69m" w:id="2"/>
       <w:bookmarkEnd w:id="2"/>
-      <w:r>
-        <w:rPr>
-          <w:b w:val="1"/>
-          <w:bCs w:val="1"/>
-          <w:color w:val="000000"/>
-          <w:sz w:val="26"/>
-          <w:szCs w:val="26"/>
-          <w:rtl w:val="0"/>
-        </w:rPr>
-        <w:t xml:space="preserve">TC-002: Overenie prijatia objednávky na email maséra</w:t>
-      </w:r>
-    </w:p>
-    <w:p>
-      <w:pPr>
-        <w:spacing w:after="240" w:before="240" w:lineRule="auto"/>
-        <w:rPr>
-          <w:b w:val="1"/>
-          <w:bCs w:val="1"/>
-        </w:rPr>
-      </w:pPr>
-      <w:r>
-        <w:rPr>
-          <w:b w:val="1"/>
-          <w:bCs w:val="1"/>
-          <w:rtl w:val="0"/>
-        </w:rPr>
-        <w:t xml:space="preserve">1. Predpoklady (Preconditions)</w:t>
-      </w:r>
-    </w:p>
-    <w:p>
-      <w:pPr>
-        <w:numPr>
-          <w:ilvl w:val="0"/>
-          <w:numId w:val="9"/>
-        </w:numPr>
-        <w:spacing w:after="0" w:afterAutospacing="0" w:before="240" w:lineRule="auto"/>
-        <w:ind w:left="720" w:hanging="360"/>
-      </w:pPr>
-      <w:r>
-        <w:rPr>
-          <w:rtl w:val="0"/>
-        </w:rPr>
-        <w:t xml:space="preserve">Test case TC-001 bol úspešne vykonaný</w:t>
-      </w:r>
-    </w:p>
-    <w:p>
-      <w:pPr>
-        <w:numPr>
-          <w:ilvl w:val="0"/>
-          <w:numId w:val="9"/>
-        </w:numPr>
-        <w:spacing w:after="240" w:before="0" w:beforeAutospacing="0" w:lineRule="auto"/>
-        <w:ind w:left="720" w:hanging="360"/>
-      </w:pPr>
-      <w:r>
-        <w:rPr>
-          <w:rtl w:val="0"/>
-        </w:rPr>
-        <w:t xml:space="preserve">Máte prístup k emailovej schránke maséra: mobilmasaze@gmail.com</w:t>
-      </w:r>
-    </w:p>
-    <w:p>
-      <w:pPr>
-        <w:spacing w:after="240" w:before="240" w:lineRule="auto"/>
-        <w:rPr>
-          <w:b w:val="1"/>
-          <w:bCs w:val="1"/>
-        </w:rPr>
-      </w:pPr>
-      <w:r>
-        <w:rPr>
-          <w:b w:val="1"/>
-          <w:bCs w:val="1"/>
-          <w:rtl w:val="0"/>
-        </w:rPr>
-        <w:t xml:space="preserve">2. Testovacie kroky (Test Steps)</w:t>
-      </w:r>
-    </w:p>
-    <w:p>
-      <w:pPr>
-        <w:numPr>
-          <w:ilvl w:val="0"/>
-          <w:numId w:val="16"/>
-        </w:numPr>
-        <w:spacing w:after="0" w:afterAutospacing="0" w:before="240" w:lineRule="auto"/>
-        <w:ind w:left="720" w:hanging="360"/>
-      </w:pPr>
-      <w:r>
-        <w:rPr>
-          <w:rtl w:val="0"/>
-        </w:rPr>
-        <w:t xml:space="preserve">Otvorte emailovú schránku maséra</w:t>
-      </w:r>
-    </w:p>
-    <w:p>
-      <w:pPr>
-        <w:numPr>
-          <w:ilvl w:val="0"/>
-          <w:numId w:val="16"/>
-        </w:numPr>
-        <w:spacing w:after="0" w:afterAutospacing="0" w:before="0" w:beforeAutospacing="0" w:lineRule="auto"/>
-        <w:ind w:left="720" w:hanging="360"/>
-      </w:pPr>
-      <w:r>
-        <w:rPr>
-          <w:rtl w:val="0"/>
-        </w:rPr>
-        <w:t xml:space="preserve">Skontrolujte prichádzajúcu poštu</w:t>
-      </w:r>
-    </w:p>
-    <w:p>
-      <w:pPr>
-        <w:numPr>
-          <w:ilvl w:val="0"/>
-          <w:numId w:val="16"/>
-        </w:numPr>
-        <w:spacing w:after="240" w:before="0" w:beforeAutospacing="0" w:lineRule="auto"/>
-        <w:ind w:left="720" w:hanging="360"/>
-      </w:pPr>
-      <w:r>
-        <w:rPr>
-          <w:rtl w:val="0"/>
-        </w:rPr>
-        <w:t xml:space="preserve">Overte, či bol doručený email s novou objednávkou</w:t>
-      </w:r>
-    </w:p>
-    <w:p>
-      <w:pPr>
-        <w:spacing w:after="240" w:before="240" w:lineRule="auto"/>
-        <w:rPr>
-          <w:b w:val="1"/>
-          <w:bCs w:val="1"/>
-        </w:rPr>
-      </w:pPr>
-      <w:r>
-        <w:rPr>
-          <w:b w:val="1"/>
-          <w:bCs w:val="1"/>
-          <w:rtl w:val="0"/>
-        </w:rPr>
-        <w:t xml:space="preserve">3. Očakávaný výsledok (Expected Result)</w:t>
-      </w:r>
-    </w:p>
-    <w:p>
-      <w:pPr>
-        <w:numPr>
-          <w:ilvl w:val="0"/>
-          <w:numId w:val="6"/>
-        </w:numPr>
-        <w:spacing w:after="0" w:afterAutospacing="0" w:before="240" w:lineRule="auto"/>
-        <w:ind w:left="720" w:hanging="360"/>
-      </w:pPr>
-      <w:r>
-        <w:rPr>
-          <w:rtl w:val="0"/>
-        </w:rPr>
-        <w:t xml:space="preserve">Email s objednávkou je doručený do 5 minút</w:t>
-      </w:r>
-    </w:p>
-    <w:p>
-      <w:pPr>
-        <w:numPr>
-          <w:ilvl w:val="0"/>
-          <w:numId w:val="6"/>
-        </w:numPr>
-        <w:spacing w:after="0" w:afterAutospacing="0" w:before="0" w:beforeAutospacing="0" w:lineRule="auto"/>
-        <w:ind w:left="720" w:hanging="360"/>
-      </w:pPr>
-      <w:r>
-        <w:rPr>
-          <w:rtl w:val="0"/>
-        </w:rPr>
-        <w:t xml:space="preserve">Email obsahuje všetky detaily objednávky:</w:t>
-      </w:r>
-    </w:p>
-    <w:p>
-      <w:pPr>
-        <w:numPr>
-          <w:ilvl w:val="1"/>
-          <w:numId w:val="6"/>
-        </w:numPr>
-        <w:spacing w:after="0" w:afterAutospacing="0" w:before="0" w:beforeAutospacing="0" w:lineRule="auto"/>
-        <w:ind w:left="1440" w:hanging="360"/>
-      </w:pPr>
-      <w:r>
-        <w:rPr>
-          <w:rtl w:val="0"/>
-        </w:rPr>
-        <w:t xml:space="preserve">Typ masáže: Klasická športová masáž 60min</w:t>
-      </w:r>
-    </w:p>
-    <w:p>
-      <w:pPr>
-        <w:numPr>
-          <w:ilvl w:val="1"/>
-          <w:numId w:val="6"/>
-        </w:numPr>
-        <w:spacing w:after="0" w:afterAutospacing="0" w:before="0" w:beforeAutospacing="0" w:lineRule="auto"/>
-        <w:ind w:left="1440" w:hanging="360"/>
-      </w:pPr>
-      <w:r>
-        <w:rPr>
-          <w:rtl w:val="0"/>
-        </w:rPr>
-        <w:t xml:space="preserve">Dátum: 15.02.2026</w:t>
-      </w:r>
-    </w:p>
-    <w:p>
-      <w:pPr>
-        <w:numPr>
-          <w:ilvl w:val="1"/>
-          <w:numId w:val="6"/>
-        </w:numPr>
-        <w:spacing w:after="0" w:afterAutospacing="0" w:before="0" w:beforeAutospacing="0" w:lineRule="auto"/>
-        <w:ind w:left="1440" w:hanging="360"/>
-      </w:pPr>
-      <w:r>
-        <w:rPr>
-          <w:rtl w:val="0"/>
-        </w:rPr>
-        <w:t xml:space="preserve">Čas: 10:00–11:00</w:t>
-      </w:r>
-    </w:p>
-    <w:p>
-      <w:pPr>
-        <w:numPr>
-          <w:ilvl w:val="1"/>
-          <w:numId w:val="6"/>
-        </w:numPr>
-        <w:spacing w:after="0" w:afterAutospacing="0" w:before="0" w:beforeAutospacing="0" w:lineRule="auto"/>
-        <w:ind w:left="1440" w:hanging="360"/>
-      </w:pPr>
-      <w:r>
-        <w:rPr>
-          <w:rtl w:val="0"/>
-        </w:rPr>
-        <w:t xml:space="preserve">Meno zákazníka: Ján Novák</w:t>
-      </w:r>
-    </w:p>
-    <w:p>
-      <w:pPr>
-        <w:numPr>
-          <w:ilvl w:val="1"/>
-          <w:numId w:val="6"/>
-        </w:numPr>
-        <w:spacing w:after="0" w:afterAutospacing="0" w:before="0" w:beforeAutospacing="0" w:lineRule="auto"/>
-        <w:ind w:left="1440" w:hanging="360"/>
-      </w:pPr>
-      <w:r>
-        <w:rPr>
-          <w:rtl w:val="0"/>
-        </w:rPr>
-        <w:t xml:space="preserve">Email zákazníka: jan.novak@example.com</w:t>
-      </w:r>
-    </w:p>
-    <w:p>
-      <w:pPr>
-        <w:numPr>
-          <w:ilvl w:val="1"/>
-          <w:numId w:val="6"/>
-        </w:numPr>
-        <w:spacing w:after="0" w:afterAutospacing="0" w:before="0" w:beforeAutospacing="0" w:lineRule="auto"/>
-        <w:ind w:left="1440" w:hanging="360"/>
-      </w:pPr>
-      <w:r>
-        <w:rPr>
-          <w:rtl w:val="0"/>
-        </w:rPr>
-        <w:t xml:space="preserve">Telefón: +421 901 234 567</w:t>
-      </w:r>
-    </w:p>
-    <w:p>
-      <w:pPr>
-        <w:numPr>
-          <w:ilvl w:val="1"/>
-          <w:numId w:val="6"/>
-        </w:numPr>
-        <w:spacing w:after="240" w:before="0" w:beforeAutospacing="0" w:lineRule="auto"/>
-        <w:ind w:left="1440" w:hanging="360"/>
-      </w:pPr>
-      <w:r>
-        <w:rPr>
-          <w:rtl w:val="0"/>
-        </w:rPr>
-        <w:t xml:space="preserve">Adresa: Bratislava, Hlavná 10, 3. poschodie</w:t>
-      </w:r>
-    </w:p>
-    <w:p>
-      <w:pPr>
-        <w:spacing w:after="240" w:before="240" w:lineRule="auto"/>
-        <w:rPr>
-          <w:b w:val="1"/>
-          <w:bCs w:val="1"/>
-        </w:rPr>
-      </w:pPr>
-      <w:r>
-        <w:rPr>
-          <w:b w:val="1"/>
-          <w:bCs w:val="1"/>
-          <w:rtl w:val="0"/>
-        </w:rPr>
-        <w:t xml:space="preserve">Poznámka / Odporúčanie</w:t>
-      </w:r>
-    </w:p>
-    <w:p>
-      <w:pPr>
-        <w:numPr>
-          <w:ilvl w:val="0"/>
-          <w:numId w:val="34"/>
-        </w:numPr>
-        <w:spacing w:after="240" w:before="240" w:lineRule="auto"/>
-        <w:ind w:left="720" w:hanging="360"/>
-      </w:pPr>
-      <w:r>
-        <w:rPr>
-          <w:rtl w:val="0"/>
-        </w:rPr>
-        <w:t xml:space="preserve">Odporúča sa doplniť automatický potvrdzovací email pre zákazníka (zlepšenie UX a dôveryhodnosti služby)</w:t>
-      </w:r>
-    </w:p>
-    <w:p>
-      <w:pPr>
-        <w:spacing w:after="240" w:before="240" w:lineRule="auto"/>
-        <w:rPr/>
-      </w:pPr>
-      <w:r>
-        <w:pict>
-          <v:rect style="width:0.0pt;height:1.5pt" o:hr="t" o:hrstd="t" o:hralign="center" fillcolor="#A0A0A0" stroked="f"/>
-        </w:pict>
-      </w:r>
       <w:r>
         <w:rPr>
           <w:rtl w:val="0"/>
@@ -813,18 +574,684 @@
           <w:szCs w:val="26"/>
         </w:rPr>
       </w:pPr>
-      <w:bookmarkStart w:colFirst="0" w:colLast="0" w:name="_dyk4z0oybejp" w:id="3"/>
+      <w:bookmarkStart w:colFirst="0" w:colLast="0" w:name="_qm3c4dq3g5px" w:id="3"/>
       <w:bookmarkEnd w:id="3"/>
       <w:r>
+        <w:rPr>
+          <w:rtl w:val="0"/>
+        </w:rPr>
+      </w:r>
+    </w:p>
+    <w:p>
+      <w:pPr>
+        <w:pStyle w:val="Heading3"/>
+        <w:keepNext w:val="0"/>
+        <w:keepLines w:val="0"/>
+        <w:spacing w:before="280" w:lineRule="auto"/>
         <w:rPr>
           <w:b w:val="1"/>
           <w:bCs w:val="1"/>
           <w:color w:val="000000"/>
           <w:sz w:val="26"/>
           <w:szCs w:val="26"/>
+        </w:rPr>
+      </w:pPr>
+      <w:bookmarkStart w:colFirst="0" w:colLast="0" w:name="_z4eo8m4o897n" w:id="4"/>
+      <w:bookmarkEnd w:id="4"/>
+      <w:r>
+        <w:rPr>
+          <w:b w:val="1"/>
+          <w:bCs w:val="1"/>
+          <w:color w:val="000000"/>
+          <w:sz w:val="26"/>
+          <w:szCs w:val="26"/>
+          <w:rtl w:val="0"/>
+        </w:rPr>
+        <w:t xml:space="preserve">TC-002: Overenie prijatia objednávky na email maséra</w:t>
+      </w:r>
+    </w:p>
+    <w:p>
+      <w:pPr>
+        <w:rPr/>
+      </w:pPr>
+      <w:r>
+        <w:rPr>
+          <w:rtl w:val="0"/>
+        </w:rPr>
+      </w:r>
+    </w:p>
+    <w:p>
+      <w:pPr>
+        <w:rPr/>
+      </w:pPr>
+      <w:r>
+        <w:rPr>
+          <w:b w:val="1"/>
+          <w:bCs w:val="1"/>
+          <w:rtl w:val="0"/>
+        </w:rPr>
+        <w:t xml:space="preserve">Entry Criteria:</w:t>
+      </w:r>
+      <w:r>
+        <w:rPr>
+          <w:rtl w:val="0"/>
+        </w:rPr>
+        <w:t xml:space="preserve"> TC-001 úspešne vykonaný</w:t>
+      </w:r>
+    </w:p>
+    <w:p>
+      <w:pPr>
+        <w:rPr/>
+      </w:pPr>
+      <w:r>
+        <w:rPr>
+          <w:b w:val="1"/>
+          <w:bCs w:val="1"/>
+          <w:rtl w:val="0"/>
+        </w:rPr>
+        <w:t xml:space="preserve">Exit Criteria:</w:t>
+      </w:r>
+      <w:r>
+        <w:rPr>
+          <w:rtl w:val="0"/>
+        </w:rPr>
+        <w:t xml:space="preserve"> Email doručený a obsahuje správne údaje</w:t>
+      </w:r>
+    </w:p>
+    <w:p>
+      <w:pPr>
+        <w:rPr/>
+      </w:pPr>
+      <w:r>
+        <w:rPr>
+          <w:b w:val="1"/>
+          <w:bCs w:val="1"/>
+          <w:rtl w:val="0"/>
+        </w:rPr>
+        <w:t xml:space="preserve">Severity:</w:t>
+      </w:r>
+      <w:r>
+        <w:rPr>
+          <w:rtl w:val="0"/>
+        </w:rPr>
+        <w:t xml:space="preserve"> Critical</w:t>
+      </w:r>
+    </w:p>
+    <w:p>
+      <w:pPr>
+        <w:rPr/>
+      </w:pPr>
+      <w:r>
+        <w:rPr>
+          <w:b w:val="1"/>
+          <w:bCs w:val="1"/>
+          <w:rtl w:val="0"/>
+        </w:rPr>
+        <w:t xml:space="preserve">Priority:</w:t>
+      </w:r>
+      <w:r>
+        <w:rPr>
+          <w:rtl w:val="0"/>
+        </w:rPr>
+        <w:t xml:space="preserve"> High</w:t>
+      </w:r>
+      <w:r>
+        <w:rPr>
+          <w:rtl w:val="0"/>
+        </w:rPr>
+      </w:r>
+    </w:p>
+    <w:p>
+      <w:pPr>
+        <w:spacing w:after="240" w:before="240" w:lineRule="auto"/>
+        <w:rPr>
+          <w:b w:val="1"/>
+          <w:bCs w:val="1"/>
+        </w:rPr>
+      </w:pPr>
+      <w:r>
+        <w:rPr>
+          <w:b w:val="1"/>
+          <w:bCs w:val="1"/>
+          <w:rtl w:val="0"/>
+        </w:rPr>
+        <w:t xml:space="preserve">1. Predpoklady (Preconditions)</w:t>
+      </w:r>
+    </w:p>
+    <w:p>
+      <w:pPr>
+        <w:numPr>
+          <w:ilvl w:val="0"/>
+          <w:numId w:val="9"/>
+        </w:numPr>
+        <w:spacing w:after="0" w:afterAutospacing="0" w:before="240" w:lineRule="auto"/>
+        <w:ind w:left="720" w:hanging="360"/>
+      </w:pPr>
+      <w:r>
+        <w:rPr>
+          <w:rtl w:val="0"/>
+        </w:rPr>
+        <w:t xml:space="preserve">Test case TC-001 bol úspešne vykonaný</w:t>
+      </w:r>
+    </w:p>
+    <w:p>
+      <w:pPr>
+        <w:numPr>
+          <w:ilvl w:val="0"/>
+          <w:numId w:val="9"/>
+        </w:numPr>
+        <w:spacing w:after="240" w:before="0" w:beforeAutospacing="0" w:lineRule="auto"/>
+        <w:ind w:left="720" w:hanging="360"/>
+      </w:pPr>
+      <w:r>
+        <w:rPr>
+          <w:rtl w:val="0"/>
+        </w:rPr>
+        <w:t xml:space="preserve">Máte prístup k emailovej schránke maséra: mobilmasaze@gmail.com</w:t>
+      </w:r>
+    </w:p>
+    <w:p>
+      <w:pPr>
+        <w:spacing w:after="240" w:before="240" w:lineRule="auto"/>
+        <w:rPr>
+          <w:b w:val="1"/>
+          <w:bCs w:val="1"/>
+        </w:rPr>
+      </w:pPr>
+      <w:r>
+        <w:rPr>
+          <w:b w:val="1"/>
+          <w:bCs w:val="1"/>
+          <w:rtl w:val="0"/>
+        </w:rPr>
+        <w:t xml:space="preserve">2. Testovacie kroky (Test Steps)</w:t>
+      </w:r>
+    </w:p>
+    <w:p>
+      <w:pPr>
+        <w:numPr>
+          <w:ilvl w:val="0"/>
+          <w:numId w:val="16"/>
+        </w:numPr>
+        <w:spacing w:after="0" w:afterAutospacing="0" w:before="240" w:lineRule="auto"/>
+        <w:ind w:left="720" w:hanging="360"/>
+      </w:pPr>
+      <w:r>
+        <w:rPr>
+          <w:rtl w:val="0"/>
+        </w:rPr>
+        <w:t xml:space="preserve">Otvorte emailovú schránku maséra</w:t>
+      </w:r>
+    </w:p>
+    <w:p>
+      <w:pPr>
+        <w:numPr>
+          <w:ilvl w:val="0"/>
+          <w:numId w:val="16"/>
+        </w:numPr>
+        <w:spacing w:after="0" w:afterAutospacing="0" w:before="0" w:beforeAutospacing="0" w:lineRule="auto"/>
+        <w:ind w:left="720" w:hanging="360"/>
+      </w:pPr>
+      <w:r>
+        <w:rPr>
+          <w:rtl w:val="0"/>
+        </w:rPr>
+        <w:t xml:space="preserve">Skontrolujte prichádzajúcu poštu</w:t>
+      </w:r>
+    </w:p>
+    <w:p>
+      <w:pPr>
+        <w:numPr>
+          <w:ilvl w:val="0"/>
+          <w:numId w:val="16"/>
+        </w:numPr>
+        <w:spacing w:after="240" w:before="0" w:beforeAutospacing="0" w:lineRule="auto"/>
+        <w:ind w:left="720" w:hanging="360"/>
+      </w:pPr>
+      <w:r>
+        <w:rPr>
+          <w:rtl w:val="0"/>
+        </w:rPr>
+        <w:t xml:space="preserve">Overte, či bol doručený email s novou objednávkou</w:t>
+      </w:r>
+    </w:p>
+    <w:p>
+      <w:pPr>
+        <w:spacing w:after="240" w:before="240" w:lineRule="auto"/>
+        <w:rPr>
+          <w:b w:val="1"/>
+          <w:bCs w:val="1"/>
+        </w:rPr>
+      </w:pPr>
+      <w:r>
+        <w:rPr>
+          <w:b w:val="1"/>
+          <w:bCs w:val="1"/>
+          <w:rtl w:val="0"/>
+        </w:rPr>
+        <w:t xml:space="preserve">3. Očakávaný výsledok (Expected Result)</w:t>
+      </w:r>
+    </w:p>
+    <w:p>
+      <w:pPr>
+        <w:numPr>
+          <w:ilvl w:val="0"/>
+          <w:numId w:val="6"/>
+        </w:numPr>
+        <w:spacing w:after="0" w:afterAutospacing="0" w:before="240" w:lineRule="auto"/>
+        <w:ind w:left="720" w:hanging="360"/>
+      </w:pPr>
+      <w:r>
+        <w:rPr>
+          <w:rtl w:val="0"/>
+        </w:rPr>
+        <w:t xml:space="preserve">Email s objednávkou je doručený do 5 minút</w:t>
+      </w:r>
+    </w:p>
+    <w:p>
+      <w:pPr>
+        <w:numPr>
+          <w:ilvl w:val="0"/>
+          <w:numId w:val="6"/>
+        </w:numPr>
+        <w:spacing w:after="0" w:afterAutospacing="0" w:before="0" w:beforeAutospacing="0" w:lineRule="auto"/>
+        <w:ind w:left="720" w:hanging="360"/>
+      </w:pPr>
+      <w:r>
+        <w:rPr>
+          <w:rtl w:val="0"/>
+        </w:rPr>
+        <w:t xml:space="preserve">Email obsahuje všetky detaily objednávky:</w:t>
+      </w:r>
+    </w:p>
+    <w:p>
+      <w:pPr>
+        <w:numPr>
+          <w:ilvl w:val="1"/>
+          <w:numId w:val="6"/>
+        </w:numPr>
+        <w:spacing w:after="0" w:afterAutospacing="0" w:before="0" w:beforeAutospacing="0" w:lineRule="auto"/>
+        <w:ind w:left="1440" w:hanging="360"/>
+      </w:pPr>
+      <w:r>
+        <w:rPr>
+          <w:rtl w:val="0"/>
+        </w:rPr>
+        <w:t xml:space="preserve">Typ masáže: Klasická športová masáž 60min</w:t>
+      </w:r>
+    </w:p>
+    <w:p>
+      <w:pPr>
+        <w:numPr>
+          <w:ilvl w:val="1"/>
+          <w:numId w:val="6"/>
+        </w:numPr>
+        <w:spacing w:after="0" w:afterAutospacing="0" w:before="0" w:beforeAutospacing="0" w:lineRule="auto"/>
+        <w:ind w:left="1440" w:hanging="360"/>
+      </w:pPr>
+      <w:r>
+        <w:rPr>
+          <w:rtl w:val="0"/>
+        </w:rPr>
+        <w:t xml:space="preserve">Dátum: 15.02.2026</w:t>
+      </w:r>
+    </w:p>
+    <w:p>
+      <w:pPr>
+        <w:numPr>
+          <w:ilvl w:val="1"/>
+          <w:numId w:val="6"/>
+        </w:numPr>
+        <w:spacing w:after="0" w:afterAutospacing="0" w:before="0" w:beforeAutospacing="0" w:lineRule="auto"/>
+        <w:ind w:left="1440" w:hanging="360"/>
+      </w:pPr>
+      <w:r>
+        <w:rPr>
+          <w:rtl w:val="0"/>
+        </w:rPr>
+        <w:t xml:space="preserve">Čas: 10:00–11:00</w:t>
+      </w:r>
+    </w:p>
+    <w:p>
+      <w:pPr>
+        <w:numPr>
+          <w:ilvl w:val="1"/>
+          <w:numId w:val="6"/>
+        </w:numPr>
+        <w:spacing w:after="0" w:afterAutospacing="0" w:before="0" w:beforeAutospacing="0" w:lineRule="auto"/>
+        <w:ind w:left="1440" w:hanging="360"/>
+      </w:pPr>
+      <w:r>
+        <w:rPr>
+          <w:rtl w:val="0"/>
+        </w:rPr>
+        <w:t xml:space="preserve">Meno zákazníka: Ján Novák</w:t>
+      </w:r>
+    </w:p>
+    <w:p>
+      <w:pPr>
+        <w:numPr>
+          <w:ilvl w:val="1"/>
+          <w:numId w:val="6"/>
+        </w:numPr>
+        <w:spacing w:after="0" w:afterAutospacing="0" w:before="0" w:beforeAutospacing="0" w:lineRule="auto"/>
+        <w:ind w:left="1440" w:hanging="360"/>
+      </w:pPr>
+      <w:r>
+        <w:rPr>
+          <w:rtl w:val="0"/>
+        </w:rPr>
+        <w:t xml:space="preserve">Email zákazníka: jan.novak@example.com</w:t>
+      </w:r>
+    </w:p>
+    <w:p>
+      <w:pPr>
+        <w:numPr>
+          <w:ilvl w:val="1"/>
+          <w:numId w:val="6"/>
+        </w:numPr>
+        <w:spacing w:after="0" w:afterAutospacing="0" w:before="0" w:beforeAutospacing="0" w:lineRule="auto"/>
+        <w:ind w:left="1440" w:hanging="360"/>
+      </w:pPr>
+      <w:r>
+        <w:rPr>
+          <w:rtl w:val="0"/>
+        </w:rPr>
+        <w:t xml:space="preserve">Telefón: +421 901 234 567</w:t>
+      </w:r>
+    </w:p>
+    <w:p>
+      <w:pPr>
+        <w:numPr>
+          <w:ilvl w:val="1"/>
+          <w:numId w:val="6"/>
+        </w:numPr>
+        <w:spacing w:after="240" w:before="0" w:beforeAutospacing="0" w:lineRule="auto"/>
+        <w:ind w:left="1440" w:hanging="360"/>
+      </w:pPr>
+      <w:r>
+        <w:rPr>
+          <w:rtl w:val="0"/>
+        </w:rPr>
+        <w:t xml:space="preserve">Adresa: Bratislava, Hlavná 10, 3. poschodie</w:t>
+      </w:r>
+    </w:p>
+    <w:p>
+      <w:pPr>
+        <w:spacing w:after="240" w:before="240" w:lineRule="auto"/>
+        <w:rPr>
+          <w:b w:val="1"/>
+          <w:bCs w:val="1"/>
+        </w:rPr>
+      </w:pPr>
+      <w:r>
+        <w:rPr>
+          <w:b w:val="1"/>
+          <w:bCs w:val="1"/>
+          <w:rtl w:val="0"/>
+        </w:rPr>
+        <w:t xml:space="preserve">Poznámka / Odporúčanie</w:t>
+      </w:r>
+    </w:p>
+    <w:p>
+      <w:pPr>
+        <w:numPr>
+          <w:ilvl w:val="0"/>
+          <w:numId w:val="34"/>
+        </w:numPr>
+        <w:spacing w:after="240" w:before="240" w:lineRule="auto"/>
+        <w:ind w:left="720" w:hanging="360"/>
+      </w:pPr>
+      <w:r>
+        <w:rPr>
+          <w:rtl w:val="0"/>
+        </w:rPr>
+        <w:t xml:space="preserve">Odporúča sa doplniť automatický potvrdzovací email pre zákazníka (zlepšenie UX a dôveryhodnosti služby)</w:t>
+      </w:r>
+    </w:p>
+    <w:p>
+      <w:pPr>
+        <w:spacing w:after="240" w:before="240" w:lineRule="auto"/>
+        <w:rPr/>
+      </w:pPr>
+      <w:r>
+        <w:pict>
+          <v:rect style="width:0.0pt;height:1.5pt" o:hr="t" o:hrstd="t" o:hralign="center" fillcolor="#A0A0A0" stroked="f"/>
+        </w:pict>
+      </w:r>
+      <w:r>
+        <w:rPr>
+          <w:rtl w:val="0"/>
+        </w:rPr>
+      </w:r>
+    </w:p>
+    <w:p>
+      <w:pPr>
+        <w:pStyle w:val="Heading3"/>
+        <w:keepNext w:val="0"/>
+        <w:keepLines w:val="0"/>
+        <w:spacing w:before="280" w:lineRule="auto"/>
+        <w:rPr>
+          <w:b w:val="1"/>
+          <w:bCs w:val="1"/>
+          <w:color w:val="000000"/>
+          <w:sz w:val="26"/>
+          <w:szCs w:val="26"/>
+        </w:rPr>
+      </w:pPr>
+      <w:bookmarkStart w:colFirst="0" w:colLast="0" w:name="_n1tmd5nll7w8" w:id="5"/>
+      <w:bookmarkEnd w:id="5"/>
+      <w:r>
+        <w:rPr>
+          <w:rtl w:val="0"/>
+        </w:rPr>
+      </w:r>
+    </w:p>
+    <w:p>
+      <w:pPr>
+        <w:pStyle w:val="Heading3"/>
+        <w:keepNext w:val="0"/>
+        <w:keepLines w:val="0"/>
+        <w:spacing w:before="280" w:lineRule="auto"/>
+        <w:rPr>
+          <w:b w:val="1"/>
+          <w:bCs w:val="1"/>
+          <w:color w:val="000000"/>
+          <w:sz w:val="26"/>
+          <w:szCs w:val="26"/>
+        </w:rPr>
+      </w:pPr>
+      <w:bookmarkStart w:colFirst="0" w:colLast="0" w:name="_19ighhs8op5m" w:id="6"/>
+      <w:bookmarkEnd w:id="6"/>
+      <w:r>
+        <w:rPr>
+          <w:rtl w:val="0"/>
+        </w:rPr>
+      </w:r>
+    </w:p>
+    <w:p>
+      <w:pPr>
+        <w:pStyle w:val="Heading3"/>
+        <w:keepNext w:val="0"/>
+        <w:keepLines w:val="0"/>
+        <w:spacing w:before="280" w:lineRule="auto"/>
+        <w:rPr>
+          <w:b w:val="1"/>
+          <w:bCs w:val="1"/>
+          <w:color w:val="000000"/>
+          <w:sz w:val="26"/>
+          <w:szCs w:val="26"/>
+        </w:rPr>
+      </w:pPr>
+      <w:bookmarkStart w:colFirst="0" w:colLast="0" w:name="_13k2fougxpmn" w:id="7"/>
+      <w:bookmarkEnd w:id="7"/>
+      <w:r>
+        <w:rPr>
+          <w:rtl w:val="0"/>
+        </w:rPr>
+      </w:r>
+    </w:p>
+    <w:p>
+      <w:pPr>
+        <w:pStyle w:val="Heading3"/>
+        <w:keepNext w:val="0"/>
+        <w:keepLines w:val="0"/>
+        <w:spacing w:before="280" w:lineRule="auto"/>
+        <w:rPr>
+          <w:b w:val="1"/>
+          <w:bCs w:val="1"/>
+          <w:color w:val="000000"/>
+          <w:sz w:val="26"/>
+          <w:szCs w:val="26"/>
+        </w:rPr>
+      </w:pPr>
+      <w:bookmarkStart w:colFirst="0" w:colLast="0" w:name="_oovppxgn8w87" w:id="8"/>
+      <w:bookmarkEnd w:id="8"/>
+      <w:r>
+        <w:rPr>
+          <w:rtl w:val="0"/>
+        </w:rPr>
+      </w:r>
+    </w:p>
+    <w:p>
+      <w:pPr>
+        <w:pStyle w:val="Heading3"/>
+        <w:keepNext w:val="0"/>
+        <w:keepLines w:val="0"/>
+        <w:spacing w:before="280" w:lineRule="auto"/>
+        <w:rPr>
+          <w:b w:val="1"/>
+          <w:bCs w:val="1"/>
+          <w:color w:val="000000"/>
+          <w:sz w:val="26"/>
+          <w:szCs w:val="26"/>
+        </w:rPr>
+      </w:pPr>
+      <w:bookmarkStart w:colFirst="0" w:colLast="0" w:name="_cuuqcxyk2x9t" w:id="9"/>
+      <w:bookmarkEnd w:id="9"/>
+      <w:r>
+        <w:rPr>
+          <w:rtl w:val="0"/>
+        </w:rPr>
+      </w:r>
+    </w:p>
+    <w:p>
+      <w:pPr>
+        <w:pStyle w:val="Heading3"/>
+        <w:keepNext w:val="0"/>
+        <w:keepLines w:val="0"/>
+        <w:spacing w:before="280" w:lineRule="auto"/>
+        <w:rPr>
+          <w:b w:val="1"/>
+          <w:bCs w:val="1"/>
+          <w:color w:val="000000"/>
+          <w:sz w:val="26"/>
+          <w:szCs w:val="26"/>
+        </w:rPr>
+      </w:pPr>
+      <w:bookmarkStart w:colFirst="0" w:colLast="0" w:name="_dyk4z0oybejp" w:id="10"/>
+      <w:bookmarkEnd w:id="10"/>
+      <w:r>
+        <w:rPr>
+          <w:b w:val="1"/>
+          <w:bCs w:val="1"/>
+          <w:color w:val="000000"/>
+          <w:sz w:val="26"/>
+          <w:szCs w:val="26"/>
           <w:rtl w:val="0"/>
         </w:rPr>
         <w:t xml:space="preserve">TC-003: Predvyplnenie konkrétnej služby po kliknutí na tlačidlo „Objednať masáž" v sekcii Služby</w:t>
+      </w:r>
+    </w:p>
+    <w:p>
+      <w:pPr>
+        <w:rPr/>
+      </w:pPr>
+      <w:r>
+        <w:rPr>
+          <w:rtl w:val="0"/>
+        </w:rPr>
+      </w:r>
+    </w:p>
+    <w:p>
+      <w:pPr>
+        <w:rPr/>
+      </w:pPr>
+      <w:r>
+        <w:rPr>
+          <w:b w:val="1"/>
+          <w:bCs w:val="1"/>
+          <w:rtl w:val="0"/>
+        </w:rPr>
+        <w:t xml:space="preserve">Entry Criteria:</w:t>
+      </w:r>
+      <w:r>
+        <w:rPr>
+          <w:rtl w:val="0"/>
+        </w:rPr>
+        <w:t xml:space="preserve"> Web je dostupný, sekcia Služby viditeľná</w:t>
+      </w:r>
+    </w:p>
+    <w:p>
+      <w:pPr>
+        <w:rPr/>
+      </w:pPr>
+      <w:r>
+        <w:rPr>
+          <w:b w:val="1"/>
+          <w:bCs w:val="1"/>
+          <w:rtl w:val="0"/>
+        </w:rPr>
+        <w:t xml:space="preserve">Exit Criteria:</w:t>
+      </w:r>
+      <w:r>
+        <w:rPr>
+          <w:rtl w:val="0"/>
+        </w:rPr>
+        <w:t xml:space="preserve"> Objednávkový formulár sa predvyplní správnou službou</w:t>
+      </w:r>
+    </w:p>
+    <w:p>
+      <w:pPr>
+        <w:rPr/>
+      </w:pPr>
+      <w:r>
+        <w:rPr>
+          <w:b w:val="1"/>
+          <w:bCs w:val="1"/>
+          <w:rtl w:val="0"/>
+        </w:rPr>
+        <w:t xml:space="preserve">Severity:</w:t>
+      </w:r>
+      <w:r>
+        <w:rPr>
+          <w:rtl w:val="0"/>
+        </w:rPr>
+        <w:t xml:space="preserve"> Medium</w:t>
+      </w:r>
+    </w:p>
+    <w:p>
+      <w:pPr>
+        <w:rPr/>
+      </w:pPr>
+      <w:r>
+        <w:rPr>
+          <w:b w:val="1"/>
+          <w:bCs w:val="1"/>
+          <w:rtl w:val="0"/>
+        </w:rPr>
+        <w:t xml:space="preserve">Priority:</w:t>
+      </w:r>
+      <w:r>
+        <w:rPr>
+          <w:rtl w:val="0"/>
+        </w:rPr>
+        <w:t xml:space="preserve"> Medium</w:t>
+      </w:r>
+      <w:r>
+        <w:rPr>
+          <w:rtl w:val="0"/>
+        </w:rPr>
       </w:r>
     </w:p>
     <w:p>
@@ -1228,18 +1655,197 @@
           <w:szCs w:val="26"/>
         </w:rPr>
       </w:pPr>
-      <w:bookmarkStart w:colFirst="0" w:colLast="0" w:name="_lw8ubvysjlvi" w:id="4"/>
-      <w:bookmarkEnd w:id="4"/>
-      <w:r>
+      <w:bookmarkStart w:colFirst="0" w:colLast="0" w:name="_qwjbjhhpxr6h" w:id="11"/>
+      <w:bookmarkEnd w:id="11"/>
+      <w:r>
+        <w:rPr>
+          <w:rtl w:val="0"/>
+        </w:rPr>
+      </w:r>
+    </w:p>
+    <w:p>
+      <w:pPr>
+        <w:pStyle w:val="Heading3"/>
+        <w:keepNext w:val="0"/>
+        <w:keepLines w:val="0"/>
+        <w:spacing w:before="280" w:lineRule="auto"/>
         <w:rPr>
           <w:b w:val="1"/>
           <w:bCs w:val="1"/>
           <w:color w:val="000000"/>
           <w:sz w:val="26"/>
           <w:szCs w:val="26"/>
+        </w:rPr>
+      </w:pPr>
+      <w:bookmarkStart w:colFirst="0" w:colLast="0" w:name="_cz2711qu308l" w:id="12"/>
+      <w:bookmarkEnd w:id="12"/>
+      <w:r>
+        <w:rPr>
+          <w:rtl w:val="0"/>
+        </w:rPr>
+      </w:r>
+    </w:p>
+    <w:p>
+      <w:pPr>
+        <w:pStyle w:val="Heading3"/>
+        <w:keepNext w:val="0"/>
+        <w:keepLines w:val="0"/>
+        <w:spacing w:before="280" w:lineRule="auto"/>
+        <w:rPr>
+          <w:b w:val="1"/>
+          <w:bCs w:val="1"/>
+          <w:color w:val="000000"/>
+          <w:sz w:val="26"/>
+          <w:szCs w:val="26"/>
+        </w:rPr>
+      </w:pPr>
+      <w:bookmarkStart w:colFirst="0" w:colLast="0" w:name="_dzzc3n5l4ssy" w:id="13"/>
+      <w:bookmarkEnd w:id="13"/>
+      <w:r>
+        <w:rPr>
+          <w:rtl w:val="0"/>
+        </w:rPr>
+      </w:r>
+    </w:p>
+    <w:p>
+      <w:pPr>
+        <w:pStyle w:val="Heading3"/>
+        <w:keepNext w:val="0"/>
+        <w:keepLines w:val="0"/>
+        <w:spacing w:before="280" w:lineRule="auto"/>
+        <w:rPr>
+          <w:b w:val="1"/>
+          <w:bCs w:val="1"/>
+          <w:color w:val="000000"/>
+          <w:sz w:val="26"/>
+          <w:szCs w:val="26"/>
+        </w:rPr>
+      </w:pPr>
+      <w:bookmarkStart w:colFirst="0" w:colLast="0" w:name="_v41d5xtf7hvh" w:id="14"/>
+      <w:bookmarkEnd w:id="14"/>
+      <w:r>
+        <w:rPr>
+          <w:rtl w:val="0"/>
+        </w:rPr>
+      </w:r>
+    </w:p>
+    <w:p>
+      <w:pPr>
+        <w:pStyle w:val="Heading3"/>
+        <w:keepNext w:val="0"/>
+        <w:keepLines w:val="0"/>
+        <w:spacing w:before="280" w:lineRule="auto"/>
+        <w:rPr>
+          <w:b w:val="1"/>
+          <w:bCs w:val="1"/>
+          <w:color w:val="000000"/>
+          <w:sz w:val="26"/>
+          <w:szCs w:val="26"/>
+        </w:rPr>
+      </w:pPr>
+      <w:bookmarkStart w:colFirst="0" w:colLast="0" w:name="_lw8ubvysjlvi" w:id="15"/>
+      <w:bookmarkEnd w:id="15"/>
+      <w:r>
+        <w:rPr>
+          <w:b w:val="1"/>
+          <w:bCs w:val="1"/>
+          <w:color w:val="000000"/>
+          <w:sz w:val="26"/>
+          <w:szCs w:val="26"/>
           <w:rtl w:val="0"/>
         </w:rPr>
         <w:t xml:space="preserve">TC-004: Pokus o odoslanie objednávky so všetkými prázdnymi poľami</w:t>
+      </w:r>
+    </w:p>
+    <w:p>
+      <w:pPr>
+        <w:rPr/>
+      </w:pPr>
+      <w:r>
+        <w:rPr>
+          <w:rtl w:val="0"/>
+        </w:rPr>
+      </w:r>
+    </w:p>
+    <w:p>
+      <w:pPr>
+        <w:rPr/>
+      </w:pPr>
+      <w:r>
+        <w:rPr>
+          <w:b w:val="1"/>
+          <w:bCs w:val="1"/>
+          <w:rtl w:val="0"/>
+        </w:rPr>
+        <w:t xml:space="preserve">Entry Criteria:</w:t>
+      </w:r>
+      <w:r>
+        <w:rPr>
+          <w:rtl w:val="0"/>
+        </w:rPr>
+        <w:t xml:space="preserve"> Formulár dostupný</w:t>
+      </w:r>
+    </w:p>
+    <w:p>
+      <w:pPr>
+        <w:rPr/>
+      </w:pPr>
+      <w:r>
+        <w:rPr>
+          <w:b w:val="1"/>
+          <w:bCs w:val="1"/>
+          <w:rtl w:val="0"/>
+        </w:rPr>
+        <w:t xml:space="preserve">Exit Criteria:</w:t>
+      </w:r>
+      <w:r>
+        <w:rPr>
+          <w:rtl w:val="0"/>
+        </w:rPr>
+        <w:t xml:space="preserve"> Formulár neodošle prázdne polia, zobrazia sa chybové hlášky</w:t>
+      </w:r>
+    </w:p>
+    <w:p>
+      <w:pPr>
+        <w:rPr/>
+      </w:pPr>
+      <w:r>
+        <w:rPr>
+          <w:b w:val="1"/>
+          <w:bCs w:val="1"/>
+          <w:rtl w:val="0"/>
+        </w:rPr>
+        <w:t xml:space="preserve">Severity:</w:t>
+      </w:r>
+      <w:r>
+        <w:rPr>
+          <w:rtl w:val="0"/>
+        </w:rPr>
+        <w:t xml:space="preserve"> High</w:t>
+      </w:r>
+    </w:p>
+    <w:p>
+      <w:pPr>
+        <w:rPr/>
+      </w:pPr>
+      <w:r>
+        <w:rPr>
+          <w:b w:val="1"/>
+          <w:bCs w:val="1"/>
+          <w:rtl w:val="0"/>
+        </w:rPr>
+        <w:t xml:space="preserve">Priority:</w:t>
+      </w:r>
+      <w:r>
+        <w:rPr>
+          <w:rtl w:val="0"/>
+        </w:rPr>
+        <w:t xml:space="preserve"> High</w:t>
+      </w:r>
+      <w:r>
+        <w:rPr>
+          <w:rtl w:val="0"/>
+        </w:rPr>
       </w:r>
     </w:p>
     <w:p>
@@ -1530,18 +2136,175 @@
           <w:szCs w:val="26"/>
         </w:rPr>
       </w:pPr>
-      <w:bookmarkStart w:colFirst="0" w:colLast="0" w:name="_5abpz7dezzv" w:id="5"/>
-      <w:bookmarkEnd w:id="5"/>
-      <w:r>
+      <w:bookmarkStart w:colFirst="0" w:colLast="0" w:name="_pt7iyooijts5" w:id="16"/>
+      <w:bookmarkEnd w:id="16"/>
+      <w:r>
+        <w:rPr>
+          <w:rtl w:val="0"/>
+        </w:rPr>
+      </w:r>
+    </w:p>
+    <w:p>
+      <w:pPr>
+        <w:pStyle w:val="Heading3"/>
+        <w:keepNext w:val="0"/>
+        <w:keepLines w:val="0"/>
+        <w:spacing w:before="280" w:lineRule="auto"/>
         <w:rPr>
           <w:b w:val="1"/>
           <w:bCs w:val="1"/>
           <w:color w:val="000000"/>
           <w:sz w:val="26"/>
           <w:szCs w:val="26"/>
+        </w:rPr>
+      </w:pPr>
+      <w:bookmarkStart w:colFirst="0" w:colLast="0" w:name="_y9xeli7r0jy3" w:id="17"/>
+      <w:bookmarkEnd w:id="17"/>
+      <w:r>
+        <w:rPr>
+          <w:rtl w:val="0"/>
+        </w:rPr>
+      </w:r>
+    </w:p>
+    <w:p>
+      <w:pPr>
+        <w:pStyle w:val="Heading3"/>
+        <w:keepNext w:val="0"/>
+        <w:keepLines w:val="0"/>
+        <w:spacing w:before="280" w:lineRule="auto"/>
+        <w:rPr>
+          <w:b w:val="1"/>
+          <w:bCs w:val="1"/>
+          <w:color w:val="000000"/>
+          <w:sz w:val="26"/>
+          <w:szCs w:val="26"/>
+        </w:rPr>
+      </w:pPr>
+      <w:bookmarkStart w:colFirst="0" w:colLast="0" w:name="_odis5xet9q3u" w:id="18"/>
+      <w:bookmarkEnd w:id="18"/>
+      <w:r>
+        <w:rPr>
+          <w:rtl w:val="0"/>
+        </w:rPr>
+      </w:r>
+    </w:p>
+    <w:p>
+      <w:pPr>
+        <w:pStyle w:val="Heading3"/>
+        <w:keepNext w:val="0"/>
+        <w:keepLines w:val="0"/>
+        <w:spacing w:before="280" w:lineRule="auto"/>
+        <w:rPr>
+          <w:b w:val="1"/>
+          <w:bCs w:val="1"/>
+          <w:color w:val="000000"/>
+          <w:sz w:val="26"/>
+          <w:szCs w:val="26"/>
+        </w:rPr>
+      </w:pPr>
+      <w:bookmarkStart w:colFirst="0" w:colLast="0" w:name="_5abpz7dezzv" w:id="19"/>
+      <w:bookmarkEnd w:id="19"/>
+      <w:r>
+        <w:rPr>
+          <w:b w:val="1"/>
+          <w:bCs w:val="1"/>
+          <w:color w:val="000000"/>
+          <w:sz w:val="26"/>
+          <w:szCs w:val="26"/>
           <w:rtl w:val="0"/>
         </w:rPr>
         <w:t xml:space="preserve">TC-005: Nesprávny formát emailu</w:t>
+      </w:r>
+    </w:p>
+    <w:p>
+      <w:pPr>
+        <w:rPr/>
+      </w:pPr>
+      <w:r>
+        <w:rPr>
+          <w:rtl w:val="0"/>
+        </w:rPr>
+      </w:r>
+    </w:p>
+    <w:p>
+      <w:pPr>
+        <w:rPr/>
+      </w:pPr>
+      <w:r>
+        <w:rPr>
+          <w:b w:val="1"/>
+          <w:bCs w:val="1"/>
+          <w:rtl w:val="0"/>
+        </w:rPr>
+        <w:t xml:space="preserve">Entry Criteria:</w:t>
+      </w:r>
+      <w:r>
+        <w:rPr>
+          <w:rtl w:val="0"/>
+        </w:rPr>
+        <w:t xml:space="preserve"> Formulár dostupný</w:t>
+      </w:r>
+    </w:p>
+    <w:p>
+      <w:pPr>
+        <w:rPr/>
+      </w:pPr>
+      <w:r>
+        <w:rPr>
+          <w:b w:val="1"/>
+          <w:bCs w:val="1"/>
+          <w:rtl w:val="0"/>
+        </w:rPr>
+        <w:t xml:space="preserve">Exit Criteria:</w:t>
+      </w:r>
+      <w:r>
+        <w:rPr>
+          <w:rtl w:val="0"/>
+        </w:rPr>
+        <w:t xml:space="preserve"> Formulár neodošle neplatný email, zobrazí sa chybová hláška</w:t>
+      </w:r>
+    </w:p>
+    <w:p>
+      <w:pPr>
+        <w:rPr/>
+      </w:pPr>
+      <w:r>
+        <w:rPr>
+          <w:b w:val="1"/>
+          <w:bCs w:val="1"/>
+          <w:rtl w:val="0"/>
+        </w:rPr>
+        <w:t xml:space="preserve">Severity:</w:t>
+      </w:r>
+      <w:r>
+        <w:rPr>
+          <w:rtl w:val="0"/>
+        </w:rPr>
+        <w:t xml:space="preserve"> High</w:t>
+      </w:r>
+    </w:p>
+    <w:p>
+      <w:pPr>
+        <w:rPr/>
+      </w:pPr>
+      <w:r>
+        <w:rPr>
+          <w:b w:val="1"/>
+          <w:bCs w:val="1"/>
+          <w:rtl w:val="0"/>
+        </w:rPr>
+        <w:t xml:space="preserve">Priority:</w:t>
+      </w:r>
+      <w:r>
+        <w:rPr>
+          <w:rtl w:val="0"/>
+        </w:rPr>
+        <w:t xml:space="preserve"> High</w:t>
+      </w:r>
+      <w:r>
+        <w:rPr>
+          <w:rtl w:val="0"/>
+        </w:rPr>
       </w:r>
     </w:p>
     <w:p>
@@ -2006,8 +2769,8 @@
           <w:szCs w:val="26"/>
         </w:rPr>
       </w:pPr>
-      <w:bookmarkStart w:colFirst="0" w:colLast="0" w:name="_m6wuierlqbi1" w:id="6"/>
-      <w:bookmarkEnd w:id="6"/>
+      <w:bookmarkStart w:colFirst="0" w:colLast="0" w:name="_m6wuierlqbi1" w:id="20"/>
+      <w:bookmarkEnd w:id="20"/>
       <w:r>
         <w:rPr>
           <w:b w:val="1"/>
@@ -2018,6 +2781,97 @@
           <w:rtl w:val="0"/>
         </w:rPr>
         <w:t xml:space="preserve">TC-006: Nesprávny formát telefónneho čísla</w:t>
+      </w:r>
+    </w:p>
+    <w:p>
+      <w:pPr>
+        <w:rPr/>
+      </w:pPr>
+      <w:r>
+        <w:rPr>
+          <w:rtl w:val="0"/>
+        </w:rPr>
+      </w:r>
+    </w:p>
+    <w:p>
+      <w:pPr>
+        <w:rPr/>
+      </w:pPr>
+      <w:r>
+        <w:rPr>
+          <w:b w:val="1"/>
+          <w:bCs w:val="1"/>
+          <w:rtl w:val="0"/>
+        </w:rPr>
+        <w:t xml:space="preserve">Entry Criteria:</w:t>
+      </w:r>
+      <w:r>
+        <w:rPr>
+          <w:rtl w:val="0"/>
+        </w:rPr>
+        <w:t xml:space="preserve"> Formulár dostupný</w:t>
+      </w:r>
+    </w:p>
+    <w:p>
+      <w:pPr>
+        <w:rPr/>
+      </w:pPr>
+      <w:r>
+        <w:rPr>
+          <w:b w:val="1"/>
+          <w:bCs w:val="1"/>
+          <w:rtl w:val="0"/>
+        </w:rPr>
+        <w:t xml:space="preserve">Exit Criteria:</w:t>
+      </w:r>
+      <w:r>
+        <w:rPr>
+          <w:rtl w:val="0"/>
+        </w:rPr>
+        <w:t xml:space="preserve"> Formulár neodošle neplatný telefón, zobrazí sa chybová hláška</w:t>
+      </w:r>
+    </w:p>
+    <w:p>
+      <w:pPr>
+        <w:rPr/>
+      </w:pPr>
+      <w:r>
+        <w:rPr>
+          <w:b w:val="1"/>
+          <w:bCs w:val="1"/>
+          <w:rtl w:val="0"/>
+        </w:rPr>
+        <w:t xml:space="preserve">Severity:</w:t>
+      </w:r>
+      <w:r>
+        <w:rPr>
+          <w:rtl w:val="0"/>
+        </w:rPr>
+        <w:t xml:space="preserve"> High</w:t>
+      </w:r>
+    </w:p>
+    <w:p>
+      <w:pPr>
+        <w:rPr/>
+      </w:pPr>
+      <w:r>
+        <w:rPr>
+          <w:b w:val="1"/>
+          <w:bCs w:val="1"/>
+          <w:rtl w:val="0"/>
+        </w:rPr>
+        <w:t xml:space="preserve">Priority:</w:t>
+      </w:r>
+      <w:r>
+        <w:rPr>
+          <w:rtl w:val="0"/>
+        </w:rPr>
+        <w:t xml:space="preserve"> High</w:t>
+      </w:r>
+      <w:r>
+        <w:rPr>
+          <w:rtl w:val="0"/>
+        </w:rPr>
       </w:r>
     </w:p>
     <w:p>
@@ -2512,18 +3366,153 @@
           <w:szCs w:val="26"/>
         </w:rPr>
       </w:pPr>
-      <w:bookmarkStart w:colFirst="0" w:colLast="0" w:name="_q2e2vo2594jm" w:id="7"/>
-      <w:bookmarkEnd w:id="7"/>
-      <w:r>
+      <w:bookmarkStart w:colFirst="0" w:colLast="0" w:name="_tsoc0sz2nqcz" w:id="21"/>
+      <w:bookmarkEnd w:id="21"/>
+      <w:r>
+        <w:rPr>
+          <w:rtl w:val="0"/>
+        </w:rPr>
+      </w:r>
+    </w:p>
+    <w:p>
+      <w:pPr>
+        <w:pStyle w:val="Heading3"/>
+        <w:keepNext w:val="0"/>
+        <w:keepLines w:val="0"/>
+        <w:spacing w:before="280" w:lineRule="auto"/>
         <w:rPr>
           <w:b w:val="1"/>
           <w:bCs w:val="1"/>
           <w:color w:val="000000"/>
           <w:sz w:val="26"/>
           <w:szCs w:val="26"/>
+        </w:rPr>
+      </w:pPr>
+      <w:bookmarkStart w:colFirst="0" w:colLast="0" w:name="_9879t7gknvb6" w:id="22"/>
+      <w:bookmarkEnd w:id="22"/>
+      <w:r>
+        <w:rPr>
+          <w:rtl w:val="0"/>
+        </w:rPr>
+      </w:r>
+    </w:p>
+    <w:p>
+      <w:pPr>
+        <w:pStyle w:val="Heading3"/>
+        <w:keepNext w:val="0"/>
+        <w:keepLines w:val="0"/>
+        <w:spacing w:before="280" w:lineRule="auto"/>
+        <w:rPr>
+          <w:b w:val="1"/>
+          <w:bCs w:val="1"/>
+          <w:color w:val="000000"/>
+          <w:sz w:val="26"/>
+          <w:szCs w:val="26"/>
+        </w:rPr>
+      </w:pPr>
+      <w:bookmarkStart w:colFirst="0" w:colLast="0" w:name="_q2e2vo2594jm" w:id="23"/>
+      <w:bookmarkEnd w:id="23"/>
+      <w:r>
+        <w:rPr>
+          <w:b w:val="1"/>
+          <w:bCs w:val="1"/>
+          <w:color w:val="000000"/>
+          <w:sz w:val="26"/>
+          <w:szCs w:val="26"/>
           <w:rtl w:val="0"/>
         </w:rPr>
         <w:t xml:space="preserve">TC-007: Neplatný dátum v poli „Predbežný deň"</w:t>
+      </w:r>
+    </w:p>
+    <w:p>
+      <w:pPr>
+        <w:rPr/>
+      </w:pPr>
+      <w:r>
+        <w:rPr>
+          <w:rtl w:val="0"/>
+        </w:rPr>
+      </w:r>
+    </w:p>
+    <w:p>
+      <w:pPr>
+        <w:rPr/>
+      </w:pPr>
+      <w:r>
+        <w:rPr>
+          <w:b w:val="1"/>
+          <w:bCs w:val="1"/>
+          <w:rtl w:val="0"/>
+        </w:rPr>
+        <w:t xml:space="preserve">Entry Criteria:</w:t>
+      </w:r>
+      <w:r>
+        <w:rPr>
+          <w:rtl w:val="0"/>
+        </w:rPr>
+        <w:t xml:space="preserve"> Formulár dostupný</w:t>
+      </w:r>
+    </w:p>
+    <w:p>
+      <w:pPr>
+        <w:rPr/>
+      </w:pPr>
+      <w:r>
+        <w:rPr>
+          <w:b w:val="1"/>
+          <w:bCs w:val="1"/>
+          <w:rtl w:val="0"/>
+        </w:rPr>
+        <w:t xml:space="preserve">Exit Criteria:</w:t>
+      </w:r>
+      <w:r>
+        <w:rPr>
+          <w:rtl w:val="0"/>
+        </w:rPr>
+        <w:t xml:space="preserve"> Formulár neodošle neplatný dátum, zobrazí sa chybová hláška</w:t>
+      </w:r>
+    </w:p>
+    <w:p>
+      <w:pPr>
+        <w:rPr/>
+      </w:pPr>
+      <w:r>
+        <w:rPr>
+          <w:b w:val="1"/>
+          <w:bCs w:val="1"/>
+          <w:rtl w:val="0"/>
+        </w:rPr>
+        <w:t xml:space="preserve">Severity:</w:t>
+      </w:r>
+      <w:r>
+        <w:rPr>
+          <w:rtl w:val="0"/>
+        </w:rPr>
+        <w:t xml:space="preserve"> Medium</w:t>
+      </w:r>
+    </w:p>
+    <w:p>
+      <w:pPr>
+        <w:rPr/>
+      </w:pPr>
+      <w:r>
+        <w:rPr>
+          <w:b w:val="1"/>
+          <w:bCs w:val="1"/>
+          <w:rtl w:val="0"/>
+        </w:rPr>
+        <w:t xml:space="preserve">Priority:</w:t>
+      </w:r>
+      <w:r>
+        <w:rPr>
+          <w:rtl w:val="0"/>
+        </w:rPr>
+        <w:t xml:space="preserve"> Medium</w:t>
+      </w:r>
+      <w:r>
+        <w:rPr>
+          <w:rtl w:val="0"/>
+        </w:rPr>
       </w:r>
     </w:p>
     <w:p>
@@ -2605,14 +3594,33 @@
           <w:ilvl w:val="0"/>
           <w:numId w:val="50"/>
         </w:numPr>
+        <w:spacing w:after="0" w:afterAutospacing="0" w:before="0" w:beforeAutospacing="0" w:lineRule="auto"/>
+        <w:ind w:left="720" w:hanging="360"/>
+      </w:pPr>
+      <w:r>
+        <w:rPr>
+          <w:rtl w:val="0"/>
+        </w:rPr>
+        <w:t xml:space="preserve">Prehliadač: Chrome (latest version)</w:t>
+      </w:r>
+    </w:p>
+    <w:p>
+      <w:pPr>
+        <w:numPr>
+          <w:ilvl w:val="0"/>
+          <w:numId w:val="50"/>
+        </w:numPr>
         <w:spacing w:after="240" w:before="0" w:beforeAutospacing="0" w:lineRule="auto"/>
         <w:ind w:left="720" w:hanging="360"/>
-      </w:pPr>
-      <w:r>
-        <w:rPr>
-          <w:rtl w:val="0"/>
-        </w:rPr>
-        <w:t xml:space="preserve">Prehliadač: Chrome (latest version)</w:t>
+        <w:rPr>
+          <w:u w:val="none"/>
+        </w:rPr>
+      </w:pPr>
+      <w:r>
+        <w:rPr>
+          <w:rtl w:val="0"/>
+        </w:rPr>
+        <w:t xml:space="preserve">Pole „Predbežný deň“ je typu date (date picker)</w:t>
       </w:r>
     </w:p>
     <w:p>
@@ -2918,18 +3926,153 @@
           <w:szCs w:val="26"/>
         </w:rPr>
       </w:pPr>
-      <w:bookmarkStart w:colFirst="0" w:colLast="0" w:name="_xs4ai2qd5zrb" w:id="8"/>
-      <w:bookmarkEnd w:id="8"/>
-      <w:r>
+      <w:bookmarkStart w:colFirst="0" w:colLast="0" w:name="_mjw2eyzb9xbt" w:id="24"/>
+      <w:bookmarkEnd w:id="24"/>
+      <w:r>
+        <w:rPr>
+          <w:rtl w:val="0"/>
+        </w:rPr>
+      </w:r>
+    </w:p>
+    <w:p>
+      <w:pPr>
+        <w:pStyle w:val="Heading3"/>
+        <w:keepNext w:val="0"/>
+        <w:keepLines w:val="0"/>
+        <w:spacing w:before="280" w:lineRule="auto"/>
         <w:rPr>
           <w:b w:val="1"/>
           <w:bCs w:val="1"/>
           <w:color w:val="000000"/>
           <w:sz w:val="26"/>
           <w:szCs w:val="26"/>
+        </w:rPr>
+      </w:pPr>
+      <w:bookmarkStart w:colFirst="0" w:colLast="0" w:name="_tdqhwrnv507n" w:id="25"/>
+      <w:bookmarkEnd w:id="25"/>
+      <w:r>
+        <w:rPr>
+          <w:rtl w:val="0"/>
+        </w:rPr>
+      </w:r>
+    </w:p>
+    <w:p>
+      <w:pPr>
+        <w:pStyle w:val="Heading3"/>
+        <w:keepNext w:val="0"/>
+        <w:keepLines w:val="0"/>
+        <w:spacing w:before="280" w:lineRule="auto"/>
+        <w:rPr>
+          <w:b w:val="1"/>
+          <w:bCs w:val="1"/>
+          <w:color w:val="000000"/>
+          <w:sz w:val="26"/>
+          <w:szCs w:val="26"/>
+        </w:rPr>
+      </w:pPr>
+      <w:bookmarkStart w:colFirst="0" w:colLast="0" w:name="_xs4ai2qd5zrb" w:id="26"/>
+      <w:bookmarkEnd w:id="26"/>
+      <w:r>
+        <w:rPr>
+          <w:b w:val="1"/>
+          <w:bCs w:val="1"/>
+          <w:color w:val="000000"/>
+          <w:sz w:val="26"/>
+          <w:szCs w:val="26"/>
           <w:rtl w:val="0"/>
         </w:rPr>
         <w:t xml:space="preserve">TC-008: Extrémne dlhé vstupy vo formulárových poliach</w:t>
+      </w:r>
+    </w:p>
+    <w:p>
+      <w:pPr>
+        <w:rPr/>
+      </w:pPr>
+      <w:r>
+        <w:rPr>
+          <w:rtl w:val="0"/>
+        </w:rPr>
+      </w:r>
+    </w:p>
+    <w:p>
+      <w:pPr>
+        <w:rPr/>
+      </w:pPr>
+      <w:r>
+        <w:rPr>
+          <w:b w:val="1"/>
+          <w:bCs w:val="1"/>
+          <w:rtl w:val="0"/>
+        </w:rPr>
+        <w:t xml:space="preserve">Entry Criteria:</w:t>
+      </w:r>
+      <w:r>
+        <w:rPr>
+          <w:rtl w:val="0"/>
+        </w:rPr>
+        <w:t xml:space="preserve"> Formulár dostupný</w:t>
+      </w:r>
+    </w:p>
+    <w:p>
+      <w:pPr>
+        <w:rPr/>
+      </w:pPr>
+      <w:r>
+        <w:rPr>
+          <w:b w:val="1"/>
+          <w:bCs w:val="1"/>
+          <w:rtl w:val="0"/>
+        </w:rPr>
+        <w:t xml:space="preserve">Exit Criteria:</w:t>
+      </w:r>
+      <w:r>
+        <w:rPr>
+          <w:rtl w:val="0"/>
+        </w:rPr>
+        <w:t xml:space="preserve"> Formulár spracuje extrémne dlhé vstupy bez pádu systému alebo zobrazí validačné hlášky</w:t>
+      </w:r>
+    </w:p>
+    <w:p>
+      <w:pPr>
+        <w:rPr/>
+      </w:pPr>
+      <w:r>
+        <w:rPr>
+          <w:b w:val="1"/>
+          <w:bCs w:val="1"/>
+          <w:rtl w:val="0"/>
+        </w:rPr>
+        <w:t xml:space="preserve">Severity:</w:t>
+      </w:r>
+      <w:r>
+        <w:rPr>
+          <w:rtl w:val="0"/>
+        </w:rPr>
+        <w:t xml:space="preserve"> Medium</w:t>
+      </w:r>
+    </w:p>
+    <w:p>
+      <w:pPr>
+        <w:rPr/>
+      </w:pPr>
+      <w:r>
+        <w:rPr>
+          <w:b w:val="1"/>
+          <w:bCs w:val="1"/>
+          <w:rtl w:val="0"/>
+        </w:rPr>
+        <w:t xml:space="preserve">Priority:</w:t>
+      </w:r>
+      <w:r>
+        <w:rPr>
+          <w:rtl w:val="0"/>
+        </w:rPr>
+        <w:t xml:space="preserve"> Medium</w:t>
+      </w:r>
+      <w:r>
+        <w:rPr>
+          <w:rtl w:val="0"/>
+        </w:rPr>
       </w:r>
     </w:p>
     <w:p>
@@ -3330,8 +4473,8 @@
           <w:szCs w:val="26"/>
         </w:rPr>
       </w:pPr>
-      <w:bookmarkStart w:colFirst="0" w:colLast="0" w:name="_b0azq8qy567z" w:id="9"/>
-      <w:bookmarkEnd w:id="9"/>
+      <w:bookmarkStart w:colFirst="0" w:colLast="0" w:name="_b0azq8qy567z" w:id="27"/>
+      <w:bookmarkEnd w:id="27"/>
       <w:r>
         <w:rPr>
           <w:b w:val="1"/>
@@ -3342,6 +4485,97 @@
           <w:rtl w:val="0"/>
         </w:rPr>
         <w:t xml:space="preserve">TC-009: SQL Injection test v input poliach</w:t>
+      </w:r>
+    </w:p>
+    <w:p>
+      <w:pPr>
+        <w:rPr/>
+      </w:pPr>
+      <w:r>
+        <w:rPr>
+          <w:rtl w:val="0"/>
+        </w:rPr>
+      </w:r>
+    </w:p>
+    <w:p>
+      <w:pPr>
+        <w:rPr/>
+      </w:pPr>
+      <w:r>
+        <w:rPr>
+          <w:b w:val="1"/>
+          <w:bCs w:val="1"/>
+          <w:rtl w:val="0"/>
+        </w:rPr>
+        <w:t xml:space="preserve">Entry Criteria:</w:t>
+      </w:r>
+      <w:r>
+        <w:rPr>
+          <w:rtl w:val="0"/>
+        </w:rPr>
+        <w:t xml:space="preserve"> Formulár dostupný</w:t>
+      </w:r>
+    </w:p>
+    <w:p>
+      <w:pPr>
+        <w:rPr/>
+      </w:pPr>
+      <w:r>
+        <w:rPr>
+          <w:b w:val="1"/>
+          <w:bCs w:val="1"/>
+          <w:rtl w:val="0"/>
+        </w:rPr>
+        <w:t xml:space="preserve">Exit Criteria:</w:t>
+      </w:r>
+      <w:r>
+        <w:rPr>
+          <w:rtl w:val="0"/>
+        </w:rPr>
+        <w:t xml:space="preserve"> SQL injection sa nevykoná, databáza nie je ovplyvnená</w:t>
+      </w:r>
+    </w:p>
+    <w:p>
+      <w:pPr>
+        <w:rPr/>
+      </w:pPr>
+      <w:r>
+        <w:rPr>
+          <w:b w:val="1"/>
+          <w:bCs w:val="1"/>
+          <w:rtl w:val="0"/>
+        </w:rPr>
+        <w:t xml:space="preserve">Severity:</w:t>
+      </w:r>
+      <w:r>
+        <w:rPr>
+          <w:rtl w:val="0"/>
+        </w:rPr>
+        <w:t xml:space="preserve"> Critical</w:t>
+      </w:r>
+    </w:p>
+    <w:p>
+      <w:pPr>
+        <w:rPr/>
+      </w:pPr>
+      <w:r>
+        <w:rPr>
+          <w:b w:val="1"/>
+          <w:bCs w:val="1"/>
+          <w:rtl w:val="0"/>
+        </w:rPr>
+        <w:t xml:space="preserve">Priority:</w:t>
+      </w:r>
+      <w:r>
+        <w:rPr>
+          <w:rtl w:val="0"/>
+        </w:rPr>
+        <w:t xml:space="preserve"> High</w:t>
+      </w:r>
+      <w:r>
+        <w:rPr>
+          <w:rtl w:val="0"/>
+        </w:rPr>
       </w:r>
     </w:p>
     <w:p>
@@ -3796,8 +5030,8 @@
           <w:szCs w:val="26"/>
         </w:rPr>
       </w:pPr>
-      <w:bookmarkStart w:colFirst="0" w:colLast="0" w:name="_tynvfm9zz4pg" w:id="10"/>
-      <w:bookmarkEnd w:id="10"/>
+      <w:bookmarkStart w:colFirst="0" w:colLast="0" w:name="_tynvfm9zz4pg" w:id="28"/>
+      <w:bookmarkEnd w:id="28"/>
       <w:r>
         <w:rPr>
           <w:b w:val="1"/>
@@ -3808,6 +5042,97 @@
           <w:rtl w:val="0"/>
         </w:rPr>
         <w:t xml:space="preserve">TC-010: XSS (Cross-Site Scripting) test v input poliach</w:t>
+      </w:r>
+    </w:p>
+    <w:p>
+      <w:pPr>
+        <w:rPr/>
+      </w:pPr>
+      <w:r>
+        <w:rPr>
+          <w:rtl w:val="0"/>
+        </w:rPr>
+      </w:r>
+    </w:p>
+    <w:p>
+      <w:pPr>
+        <w:rPr/>
+      </w:pPr>
+      <w:r>
+        <w:rPr>
+          <w:b w:val="1"/>
+          <w:bCs w:val="1"/>
+          <w:rtl w:val="0"/>
+        </w:rPr>
+        <w:t xml:space="preserve">Entry Criteria:</w:t>
+      </w:r>
+      <w:r>
+        <w:rPr>
+          <w:rtl w:val="0"/>
+        </w:rPr>
+        <w:t xml:space="preserve"> Formulár dostupný</w:t>
+      </w:r>
+    </w:p>
+    <w:p>
+      <w:pPr>
+        <w:rPr/>
+      </w:pPr>
+      <w:r>
+        <w:rPr>
+          <w:b w:val="1"/>
+          <w:bCs w:val="1"/>
+          <w:rtl w:val="0"/>
+        </w:rPr>
+        <w:t xml:space="preserve">Exit Criteria:</w:t>
+      </w:r>
+      <w:r>
+        <w:rPr>
+          <w:rtl w:val="0"/>
+        </w:rPr>
+        <w:t xml:space="preserve"> Skripty sa nespustia, vstupy bezpečne zobrazené</w:t>
+      </w:r>
+    </w:p>
+    <w:p>
+      <w:pPr>
+        <w:rPr/>
+      </w:pPr>
+      <w:r>
+        <w:rPr>
+          <w:b w:val="1"/>
+          <w:bCs w:val="1"/>
+          <w:rtl w:val="0"/>
+        </w:rPr>
+        <w:t xml:space="preserve">Severity:</w:t>
+      </w:r>
+      <w:r>
+        <w:rPr>
+          <w:rtl w:val="0"/>
+        </w:rPr>
+        <w:t xml:space="preserve"> Critical</w:t>
+      </w:r>
+    </w:p>
+    <w:p>
+      <w:pPr>
+        <w:rPr/>
+      </w:pPr>
+      <w:r>
+        <w:rPr>
+          <w:b w:val="1"/>
+          <w:bCs w:val="1"/>
+          <w:rtl w:val="0"/>
+        </w:rPr>
+        <w:t xml:space="preserve">Priority:</w:t>
+      </w:r>
+      <w:r>
+        <w:rPr>
+          <w:rtl w:val="0"/>
+        </w:rPr>
+        <w:t xml:space="preserve"> High</w:t>
+      </w:r>
+      <w:r>
+        <w:rPr>
+          <w:rtl w:val="0"/>
+        </w:rPr>
       </w:r>
     </w:p>
     <w:p>
@@ -4286,8 +5611,8 @@
           <w:szCs w:val="26"/>
         </w:rPr>
       </w:pPr>
-      <w:bookmarkStart w:colFirst="0" w:colLast="0" w:name="_bksxm37qvdsp" w:id="11"/>
-      <w:bookmarkEnd w:id="11"/>
+      <w:bookmarkStart w:colFirst="0" w:colLast="0" w:name="_bksxm37qvdsp" w:id="29"/>
+      <w:bookmarkEnd w:id="29"/>
       <w:r>
         <w:rPr>
           <w:b w:val="1"/>
@@ -4298,6 +5623,97 @@
           <w:rtl w:val="0"/>
         </w:rPr>
         <w:t xml:space="preserve">TC-011: Špeciálne znaky v input poliach</w:t>
+      </w:r>
+    </w:p>
+    <w:p>
+      <w:pPr>
+        <w:rPr/>
+      </w:pPr>
+      <w:r>
+        <w:rPr>
+          <w:rtl w:val="0"/>
+        </w:rPr>
+      </w:r>
+    </w:p>
+    <w:p>
+      <w:pPr>
+        <w:rPr/>
+      </w:pPr>
+      <w:r>
+        <w:rPr>
+          <w:b w:val="1"/>
+          <w:bCs w:val="1"/>
+          <w:rtl w:val="0"/>
+        </w:rPr>
+        <w:t xml:space="preserve">Entry Criteria:</w:t>
+      </w:r>
+      <w:r>
+        <w:rPr>
+          <w:rtl w:val="0"/>
+        </w:rPr>
+        <w:t xml:space="preserve"> Formulár dostupný</w:t>
+      </w:r>
+    </w:p>
+    <w:p>
+      <w:pPr>
+        <w:rPr/>
+      </w:pPr>
+      <w:r>
+        <w:rPr>
+          <w:b w:val="1"/>
+          <w:bCs w:val="1"/>
+          <w:rtl w:val="0"/>
+        </w:rPr>
+        <w:t xml:space="preserve">Exit Criteria:</w:t>
+      </w:r>
+      <w:r>
+        <w:rPr>
+          <w:rtl w:val="0"/>
+        </w:rPr>
+        <w:t xml:space="preserve"> Formulár úspešne spracuje špeciálne znaky</w:t>
+      </w:r>
+    </w:p>
+    <w:p>
+      <w:pPr>
+        <w:rPr/>
+      </w:pPr>
+      <w:r>
+        <w:rPr>
+          <w:b w:val="1"/>
+          <w:bCs w:val="1"/>
+          <w:rtl w:val="0"/>
+        </w:rPr>
+        <w:t xml:space="preserve">Severity:</w:t>
+      </w:r>
+      <w:r>
+        <w:rPr>
+          <w:rtl w:val="0"/>
+        </w:rPr>
+        <w:t xml:space="preserve"> Medium</w:t>
+      </w:r>
+    </w:p>
+    <w:p>
+      <w:pPr>
+        <w:rPr/>
+      </w:pPr>
+      <w:r>
+        <w:rPr>
+          <w:b w:val="1"/>
+          <w:bCs w:val="1"/>
+          <w:rtl w:val="0"/>
+        </w:rPr>
+        <w:t xml:space="preserve">Priority:</w:t>
+      </w:r>
+      <w:r>
+        <w:rPr>
+          <w:rtl w:val="0"/>
+        </w:rPr>
+        <w:t xml:space="preserve"> Medium</w:t>
+      </w:r>
+      <w:r>
+        <w:rPr>
+          <w:rtl w:val="0"/>
+        </w:rPr>
       </w:r>
     </w:p>
     <w:p>
@@ -4742,8 +6158,8 @@
           <w:szCs w:val="26"/>
         </w:rPr>
       </w:pPr>
-      <w:bookmarkStart w:colFirst="0" w:colLast="0" w:name="_jj57xuqj2rbw" w:id="12"/>
-      <w:bookmarkEnd w:id="12"/>
+      <w:bookmarkStart w:colFirst="0" w:colLast="0" w:name="_jj57xuqj2rbw" w:id="30"/>
+      <w:bookmarkEnd w:id="30"/>
       <w:r>
         <w:rPr>
           <w:b w:val="1"/>
@@ -4754,6 +6170,97 @@
           <w:rtl w:val="0"/>
         </w:rPr>
         <w:t xml:space="preserve">TC-012: Zatvorenie success popupu a kontrola stavu formulára</w:t>
+      </w:r>
+    </w:p>
+    <w:p>
+      <w:pPr>
+        <w:rPr/>
+      </w:pPr>
+      <w:r>
+        <w:rPr>
+          <w:rtl w:val="0"/>
+        </w:rPr>
+      </w:r>
+    </w:p>
+    <w:p>
+      <w:pPr>
+        <w:rPr/>
+      </w:pPr>
+      <w:r>
+        <w:rPr>
+          <w:b w:val="1"/>
+          <w:bCs w:val="1"/>
+          <w:rtl w:val="0"/>
+        </w:rPr>
+        <w:t xml:space="preserve">Entry Criteria:</w:t>
+      </w:r>
+      <w:r>
+        <w:rPr>
+          <w:rtl w:val="0"/>
+        </w:rPr>
+        <w:t xml:space="preserve"> TC-001 úspešne vykonaný</w:t>
+      </w:r>
+    </w:p>
+    <w:p>
+      <w:pPr>
+        <w:rPr/>
+      </w:pPr>
+      <w:r>
+        <w:rPr>
+          <w:b w:val="1"/>
+          <w:bCs w:val="1"/>
+          <w:rtl w:val="0"/>
+        </w:rPr>
+        <w:t xml:space="preserve">Exit Criteria:</w:t>
+      </w:r>
+      <w:r>
+        <w:rPr>
+          <w:rtl w:val="0"/>
+        </w:rPr>
+        <w:t xml:space="preserve"> Popup zatvorený, formulár resetovaný</w:t>
+      </w:r>
+    </w:p>
+    <w:p>
+      <w:pPr>
+        <w:rPr/>
+      </w:pPr>
+      <w:r>
+        <w:rPr>
+          <w:b w:val="1"/>
+          <w:bCs w:val="1"/>
+          <w:rtl w:val="0"/>
+        </w:rPr>
+        <w:t xml:space="preserve">Severity:</w:t>
+      </w:r>
+      <w:r>
+        <w:rPr>
+          <w:rtl w:val="0"/>
+        </w:rPr>
+        <w:t xml:space="preserve"> Medium</w:t>
+      </w:r>
+    </w:p>
+    <w:p>
+      <w:pPr>
+        <w:rPr/>
+      </w:pPr>
+      <w:r>
+        <w:rPr>
+          <w:b w:val="1"/>
+          <w:bCs w:val="1"/>
+          <w:rtl w:val="0"/>
+        </w:rPr>
+        <w:t xml:space="preserve">Priority:</w:t>
+      </w:r>
+      <w:r>
+        <w:rPr>
+          <w:rtl w:val="0"/>
+        </w:rPr>
+        <w:t xml:space="preserve"> Medium</w:t>
+      </w:r>
+      <w:r>
+        <w:rPr>
+          <w:rtl w:val="0"/>
+        </w:rPr>
       </w:r>
     </w:p>
     <w:p>
@@ -4917,18 +6424,197 @@
           <w:szCs w:val="26"/>
         </w:rPr>
       </w:pPr>
-      <w:bookmarkStart w:colFirst="0" w:colLast="0" w:name="_u0p45evuc5oa" w:id="13"/>
-      <w:bookmarkEnd w:id="13"/>
-      <w:r>
+      <w:bookmarkStart w:colFirst="0" w:colLast="0" w:name="_4vfkdb7vxyst" w:id="31"/>
+      <w:bookmarkEnd w:id="31"/>
+      <w:r>
+        <w:rPr>
+          <w:rtl w:val="0"/>
+        </w:rPr>
+      </w:r>
+    </w:p>
+    <w:p>
+      <w:pPr>
+        <w:pStyle w:val="Heading3"/>
+        <w:keepNext w:val="0"/>
+        <w:keepLines w:val="0"/>
+        <w:spacing w:before="280" w:lineRule="auto"/>
         <w:rPr>
           <w:b w:val="1"/>
           <w:bCs w:val="1"/>
           <w:color w:val="000000"/>
           <w:sz w:val="26"/>
           <w:szCs w:val="26"/>
+        </w:rPr>
+      </w:pPr>
+      <w:bookmarkStart w:colFirst="0" w:colLast="0" w:name="_4pw25m9ftove" w:id="32"/>
+      <w:bookmarkEnd w:id="32"/>
+      <w:r>
+        <w:rPr>
+          <w:rtl w:val="0"/>
+        </w:rPr>
+      </w:r>
+    </w:p>
+    <w:p>
+      <w:pPr>
+        <w:pStyle w:val="Heading3"/>
+        <w:keepNext w:val="0"/>
+        <w:keepLines w:val="0"/>
+        <w:spacing w:before="280" w:lineRule="auto"/>
+        <w:rPr>
+          <w:b w:val="1"/>
+          <w:bCs w:val="1"/>
+          <w:color w:val="000000"/>
+          <w:sz w:val="26"/>
+          <w:szCs w:val="26"/>
+        </w:rPr>
+      </w:pPr>
+      <w:bookmarkStart w:colFirst="0" w:colLast="0" w:name="_a1x5buf36oox" w:id="33"/>
+      <w:bookmarkEnd w:id="33"/>
+      <w:r>
+        <w:rPr>
+          <w:rtl w:val="0"/>
+        </w:rPr>
+      </w:r>
+    </w:p>
+    <w:p>
+      <w:pPr>
+        <w:pStyle w:val="Heading3"/>
+        <w:keepNext w:val="0"/>
+        <w:keepLines w:val="0"/>
+        <w:spacing w:before="280" w:lineRule="auto"/>
+        <w:rPr>
+          <w:b w:val="1"/>
+          <w:bCs w:val="1"/>
+          <w:color w:val="000000"/>
+          <w:sz w:val="26"/>
+          <w:szCs w:val="26"/>
+        </w:rPr>
+      </w:pPr>
+      <w:bookmarkStart w:colFirst="0" w:colLast="0" w:name="_qee8dmiltdod" w:id="34"/>
+      <w:bookmarkEnd w:id="34"/>
+      <w:r>
+        <w:rPr>
+          <w:rtl w:val="0"/>
+        </w:rPr>
+      </w:r>
+    </w:p>
+    <w:p>
+      <w:pPr>
+        <w:pStyle w:val="Heading3"/>
+        <w:keepNext w:val="0"/>
+        <w:keepLines w:val="0"/>
+        <w:spacing w:before="280" w:lineRule="auto"/>
+        <w:rPr>
+          <w:b w:val="1"/>
+          <w:bCs w:val="1"/>
+          <w:color w:val="000000"/>
+          <w:sz w:val="26"/>
+          <w:szCs w:val="26"/>
+        </w:rPr>
+      </w:pPr>
+      <w:bookmarkStart w:colFirst="0" w:colLast="0" w:name="_u0p45evuc5oa" w:id="35"/>
+      <w:bookmarkEnd w:id="35"/>
+      <w:r>
+        <w:rPr>
+          <w:b w:val="1"/>
+          <w:bCs w:val="1"/>
+          <w:color w:val="000000"/>
+          <w:sz w:val="26"/>
+          <w:szCs w:val="26"/>
           <w:rtl w:val="0"/>
         </w:rPr>
         <w:t xml:space="preserve">TC-013: Navigácia cez „Kontakt" v menu</w:t>
+      </w:r>
+    </w:p>
+    <w:p>
+      <w:pPr>
+        <w:rPr/>
+      </w:pPr>
+      <w:r>
+        <w:rPr>
+          <w:rtl w:val="0"/>
+        </w:rPr>
+      </w:r>
+    </w:p>
+    <w:p>
+      <w:pPr>
+        <w:rPr/>
+      </w:pPr>
+      <w:r>
+        <w:rPr>
+          <w:b w:val="1"/>
+          <w:bCs w:val="1"/>
+          <w:rtl w:val="0"/>
+        </w:rPr>
+        <w:t xml:space="preserve">Entry Criteria:</w:t>
+      </w:r>
+      <w:r>
+        <w:rPr>
+          <w:rtl w:val="0"/>
+        </w:rPr>
+        <w:t xml:space="preserve"> Web dostupný</w:t>
+      </w:r>
+    </w:p>
+    <w:p>
+      <w:pPr>
+        <w:rPr/>
+      </w:pPr>
+      <w:r>
+        <w:rPr>
+          <w:b w:val="1"/>
+          <w:bCs w:val="1"/>
+          <w:rtl w:val="0"/>
+        </w:rPr>
+        <w:t xml:space="preserve">Exit Criteria:</w:t>
+      </w:r>
+      <w:r>
+        <w:rPr>
+          <w:rtl w:val="0"/>
+        </w:rPr>
+        <w:t xml:space="preserve"> Formulár viditeľný po scrollnutí</w:t>
+      </w:r>
+    </w:p>
+    <w:p>
+      <w:pPr>
+        <w:rPr/>
+      </w:pPr>
+      <w:r>
+        <w:rPr>
+          <w:b w:val="1"/>
+          <w:bCs w:val="1"/>
+          <w:rtl w:val="0"/>
+        </w:rPr>
+        <w:t xml:space="preserve">Severity:</w:t>
+      </w:r>
+      <w:r>
+        <w:rPr>
+          <w:rtl w:val="0"/>
+        </w:rPr>
+        <w:t xml:space="preserve"> Low</w:t>
+      </w:r>
+    </w:p>
+    <w:p>
+      <w:pPr>
+        <w:rPr/>
+      </w:pPr>
+      <w:r>
+        <w:rPr>
+          <w:b w:val="1"/>
+          <w:bCs w:val="1"/>
+          <w:rtl w:val="0"/>
+        </w:rPr>
+        <w:t xml:space="preserve">Priority:</w:t>
+      </w:r>
+      <w:r>
+        <w:rPr>
+          <w:rtl w:val="0"/>
+        </w:rPr>
+        <w:t xml:space="preserve"> Low</w:t>
+      </w:r>
+      <w:r>
+        <w:rPr>
+          <w:rtl w:val="0"/>
+        </w:rPr>
       </w:r>
     </w:p>
     <w:p>
@@ -5155,8 +6841,8 @@
           <w:szCs w:val="26"/>
         </w:rPr>
       </w:pPr>
-      <w:bookmarkStart w:colFirst="0" w:colLast="0" w:name="_ovgmg5ye5fgq" w:id="14"/>
-      <w:bookmarkEnd w:id="14"/>
+      <w:bookmarkStart w:colFirst="0" w:colLast="0" w:name="_ovgmg5ye5fgq" w:id="36"/>
+      <w:bookmarkEnd w:id="36"/>
       <w:r>
         <w:rPr>
           <w:b w:val="1"/>
@@ -5167,6 +6853,97 @@
           <w:rtl w:val="0"/>
         </w:rPr>
         <w:t xml:space="preserve">TC-014: Navigácia cez button „Objednať" v Hero sekcii</w:t>
+      </w:r>
+    </w:p>
+    <w:p>
+      <w:pPr>
+        <w:rPr/>
+      </w:pPr>
+      <w:r>
+        <w:rPr>
+          <w:rtl w:val="0"/>
+        </w:rPr>
+      </w:r>
+    </w:p>
+    <w:p>
+      <w:pPr>
+        <w:rPr/>
+      </w:pPr>
+      <w:r>
+        <w:rPr>
+          <w:b w:val="1"/>
+          <w:bCs w:val="1"/>
+          <w:rtl w:val="0"/>
+        </w:rPr>
+        <w:t xml:space="preserve">Entry Criteria:</w:t>
+      </w:r>
+      <w:r>
+        <w:rPr>
+          <w:rtl w:val="0"/>
+        </w:rPr>
+        <w:t xml:space="preserve"> Web dostupný</w:t>
+      </w:r>
+    </w:p>
+    <w:p>
+      <w:pPr>
+        <w:rPr/>
+      </w:pPr>
+      <w:r>
+        <w:rPr>
+          <w:b w:val="1"/>
+          <w:bCs w:val="1"/>
+          <w:rtl w:val="0"/>
+        </w:rPr>
+        <w:t xml:space="preserve">Exit Criteria:</w:t>
+      </w:r>
+      <w:r>
+        <w:rPr>
+          <w:rtl w:val="0"/>
+        </w:rPr>
+        <w:t xml:space="preserve"> Formulár viditeľný po scrollnutí</w:t>
+      </w:r>
+    </w:p>
+    <w:p>
+      <w:pPr>
+        <w:rPr/>
+      </w:pPr>
+      <w:r>
+        <w:rPr>
+          <w:b w:val="1"/>
+          <w:bCs w:val="1"/>
+          <w:rtl w:val="0"/>
+        </w:rPr>
+        <w:t xml:space="preserve">Severity:</w:t>
+      </w:r>
+      <w:r>
+        <w:rPr>
+          <w:rtl w:val="0"/>
+        </w:rPr>
+        <w:t xml:space="preserve"> Low</w:t>
+      </w:r>
+    </w:p>
+    <w:p>
+      <w:pPr>
+        <w:rPr/>
+      </w:pPr>
+      <w:r>
+        <w:rPr>
+          <w:b w:val="1"/>
+          <w:bCs w:val="1"/>
+          <w:rtl w:val="0"/>
+        </w:rPr>
+        <w:t xml:space="preserve">Priority:</w:t>
+      </w:r>
+      <w:r>
+        <w:rPr>
+          <w:rtl w:val="0"/>
+        </w:rPr>
+        <w:t xml:space="preserve"> Low</w:t>
+      </w:r>
+      <w:r>
+        <w:rPr>
+          <w:rtl w:val="0"/>
+        </w:rPr>
       </w:r>
     </w:p>
     <w:p>
@@ -5393,8 +7170,8 @@
           <w:szCs w:val="26"/>
         </w:rPr>
       </w:pPr>
-      <w:bookmarkStart w:colFirst="0" w:colLast="0" w:name="_530qq7kpcu2e" w:id="15"/>
-      <w:bookmarkEnd w:id="15"/>
+      <w:bookmarkStart w:colFirst="0" w:colLast="0" w:name="_530qq7kpcu2e" w:id="37"/>
+      <w:bookmarkEnd w:id="37"/>
       <w:r>
         <w:rPr>
           <w:b w:val="1"/>
@@ -5405,6 +7182,97 @@
           <w:rtl w:val="0"/>
         </w:rPr>
         <w:t xml:space="preserve">TC-015: Zobrazenie a funkčnosť formulára na mobile zariadení</w:t>
+      </w:r>
+    </w:p>
+    <w:p>
+      <w:pPr>
+        <w:rPr/>
+      </w:pPr>
+      <w:r>
+        <w:rPr>
+          <w:rtl w:val="0"/>
+        </w:rPr>
+      </w:r>
+    </w:p>
+    <w:p>
+      <w:pPr>
+        <w:rPr/>
+      </w:pPr>
+      <w:r>
+        <w:rPr>
+          <w:b w:val="1"/>
+          <w:bCs w:val="1"/>
+          <w:rtl w:val="0"/>
+        </w:rPr>
+        <w:t xml:space="preserve">Entry Criteria:</w:t>
+      </w:r>
+      <w:r>
+        <w:rPr>
+          <w:rtl w:val="0"/>
+        </w:rPr>
+        <w:t xml:space="preserve"> Web dostupný, test na mobile</w:t>
+      </w:r>
+    </w:p>
+    <w:p>
+      <w:pPr>
+        <w:rPr/>
+      </w:pPr>
+      <w:r>
+        <w:rPr>
+          <w:b w:val="1"/>
+          <w:bCs w:val="1"/>
+          <w:rtl w:val="0"/>
+        </w:rPr>
+        <w:t xml:space="preserve">Exit Criteria:</w:t>
+      </w:r>
+      <w:r>
+        <w:rPr>
+          <w:rtl w:val="0"/>
+        </w:rPr>
+        <w:t xml:space="preserve"> Formulár responzívny a čitateľný, success popup zobrazený</w:t>
+      </w:r>
+    </w:p>
+    <w:p>
+      <w:pPr>
+        <w:rPr/>
+      </w:pPr>
+      <w:r>
+        <w:rPr>
+          <w:b w:val="1"/>
+          <w:bCs w:val="1"/>
+          <w:rtl w:val="0"/>
+        </w:rPr>
+        <w:t xml:space="preserve">Severity:</w:t>
+      </w:r>
+      <w:r>
+        <w:rPr>
+          <w:rtl w:val="0"/>
+        </w:rPr>
+        <w:t xml:space="preserve"> Medium</w:t>
+      </w:r>
+    </w:p>
+    <w:p>
+      <w:pPr>
+        <w:rPr/>
+      </w:pPr>
+      <w:r>
+        <w:rPr>
+          <w:b w:val="1"/>
+          <w:bCs w:val="1"/>
+          <w:rtl w:val="0"/>
+        </w:rPr>
+        <w:t xml:space="preserve">Priority:</w:t>
+      </w:r>
+      <w:r>
+        <w:rPr>
+          <w:rtl w:val="0"/>
+        </w:rPr>
+        <w:t xml:space="preserve"> Medium</w:t>
+      </w:r>
+      <w:r>
+        <w:rPr>
+          <w:rtl w:val="0"/>
+        </w:rPr>
       </w:r>
     </w:p>
     <w:p>
@@ -5760,8 +7628,8 @@
           <w:szCs w:val="26"/>
         </w:rPr>
       </w:pPr>
-      <w:bookmarkStart w:colFirst="0" w:colLast="0" w:name="_lfuqk7ft8adi" w:id="16"/>
-      <w:bookmarkEnd w:id="16"/>
+      <w:bookmarkStart w:colFirst="0" w:colLast="0" w:name="_lfuqk7ft8adi" w:id="38"/>
+      <w:bookmarkEnd w:id="38"/>
       <w:r>
         <w:rPr>
           <w:b w:val="1"/>
@@ -5772,6 +7640,97 @@
           <w:rtl w:val="0"/>
         </w:rPr>
         <w:t xml:space="preserve">TC-016: Zobrazenie a funkčnosť formulára na tablet zariadení</w:t>
+      </w:r>
+    </w:p>
+    <w:p>
+      <w:pPr>
+        <w:rPr/>
+      </w:pPr>
+      <w:r>
+        <w:rPr>
+          <w:rtl w:val="0"/>
+        </w:rPr>
+      </w:r>
+    </w:p>
+    <w:p>
+      <w:pPr>
+        <w:rPr/>
+      </w:pPr>
+      <w:r>
+        <w:rPr>
+          <w:b w:val="1"/>
+          <w:bCs w:val="1"/>
+          <w:rtl w:val="0"/>
+        </w:rPr>
+        <w:t xml:space="preserve">Entry Criteria:</w:t>
+      </w:r>
+      <w:r>
+        <w:rPr>
+          <w:rtl w:val="0"/>
+        </w:rPr>
+        <w:t xml:space="preserve"> Web dostupný, test na tablete</w:t>
+      </w:r>
+    </w:p>
+    <w:p>
+      <w:pPr>
+        <w:rPr/>
+      </w:pPr>
+      <w:r>
+        <w:rPr>
+          <w:b w:val="1"/>
+          <w:bCs w:val="1"/>
+          <w:rtl w:val="0"/>
+        </w:rPr>
+        <w:t xml:space="preserve">Exit Criteria:</w:t>
+      </w:r>
+      <w:r>
+        <w:rPr>
+          <w:rtl w:val="0"/>
+        </w:rPr>
+        <w:t xml:space="preserve"> Formulár responzívny, popup zobrazený</w:t>
+      </w:r>
+    </w:p>
+    <w:p>
+      <w:pPr>
+        <w:rPr/>
+      </w:pPr>
+      <w:r>
+        <w:rPr>
+          <w:b w:val="1"/>
+          <w:bCs w:val="1"/>
+          <w:rtl w:val="0"/>
+        </w:rPr>
+        <w:t xml:space="preserve">Severity:</w:t>
+      </w:r>
+      <w:r>
+        <w:rPr>
+          <w:rtl w:val="0"/>
+        </w:rPr>
+        <w:t xml:space="preserve"> Medium</w:t>
+      </w:r>
+    </w:p>
+    <w:p>
+      <w:pPr>
+        <w:rPr/>
+      </w:pPr>
+      <w:r>
+        <w:rPr>
+          <w:b w:val="1"/>
+          <w:bCs w:val="1"/>
+          <w:rtl w:val="0"/>
+        </w:rPr>
+        <w:t xml:space="preserve">Priority:</w:t>
+      </w:r>
+      <w:r>
+        <w:rPr>
+          <w:rtl w:val="0"/>
+        </w:rPr>
+        <w:t xml:space="preserve"> Medium</w:t>
+      </w:r>
+      <w:r>
+        <w:rPr>
+          <w:rtl w:val="0"/>
+        </w:rPr>
       </w:r>
     </w:p>
     <w:p>
@@ -6111,8 +8070,8 @@
           <w:szCs w:val="26"/>
         </w:rPr>
       </w:pPr>
-      <w:bookmarkStart w:colFirst="0" w:colLast="0" w:name="_rx10nphtojs0" w:id="17"/>
-      <w:bookmarkEnd w:id="17"/>
+      <w:bookmarkStart w:colFirst="0" w:colLast="0" w:name="_rx10nphtojs0" w:id="39"/>
+      <w:bookmarkEnd w:id="39"/>
       <w:r>
         <w:rPr>
           <w:b w:val="1"/>
@@ -6123,6 +8082,97 @@
           <w:rtl w:val="0"/>
         </w:rPr>
         <w:t xml:space="preserve">TC-017: Funkčnosť formulára v prehliadači Firefox</w:t>
+      </w:r>
+    </w:p>
+    <w:p>
+      <w:pPr>
+        <w:rPr/>
+      </w:pPr>
+      <w:r>
+        <w:rPr>
+          <w:rtl w:val="0"/>
+        </w:rPr>
+      </w:r>
+    </w:p>
+    <w:p>
+      <w:pPr>
+        <w:rPr/>
+      </w:pPr>
+      <w:r>
+        <w:rPr>
+          <w:b w:val="1"/>
+          <w:bCs w:val="1"/>
+          <w:rtl w:val="0"/>
+        </w:rPr>
+        <w:t xml:space="preserve">Entry Criteria:</w:t>
+      </w:r>
+      <w:r>
+        <w:rPr>
+          <w:rtl w:val="0"/>
+        </w:rPr>
+        <w:t xml:space="preserve"> Web dostupný, Firefox</w:t>
+      </w:r>
+    </w:p>
+    <w:p>
+      <w:pPr>
+        <w:rPr/>
+      </w:pPr>
+      <w:r>
+        <w:rPr>
+          <w:b w:val="1"/>
+          <w:bCs w:val="1"/>
+          <w:rtl w:val="0"/>
+        </w:rPr>
+        <w:t xml:space="preserve">Exit Criteria:</w:t>
+      </w:r>
+      <w:r>
+        <w:rPr>
+          <w:rtl w:val="0"/>
+        </w:rPr>
+        <w:t xml:space="preserve"> Formulár funguje ako v Chrome</w:t>
+      </w:r>
+    </w:p>
+    <w:p>
+      <w:pPr>
+        <w:rPr/>
+      </w:pPr>
+      <w:r>
+        <w:rPr>
+          <w:b w:val="1"/>
+          <w:bCs w:val="1"/>
+          <w:rtl w:val="0"/>
+        </w:rPr>
+        <w:t xml:space="preserve">Severity:</w:t>
+      </w:r>
+      <w:r>
+        <w:rPr>
+          <w:rtl w:val="0"/>
+        </w:rPr>
+        <w:t xml:space="preserve"> Medium</w:t>
+      </w:r>
+    </w:p>
+    <w:p>
+      <w:pPr>
+        <w:rPr/>
+      </w:pPr>
+      <w:r>
+        <w:rPr>
+          <w:b w:val="1"/>
+          <w:bCs w:val="1"/>
+          <w:rtl w:val="0"/>
+        </w:rPr>
+        <w:t xml:space="preserve">Priority:</w:t>
+      </w:r>
+      <w:r>
+        <w:rPr>
+          <w:rtl w:val="0"/>
+        </w:rPr>
+        <w:t xml:space="preserve"> Medium</w:t>
+      </w:r>
+      <w:r>
+        <w:rPr>
+          <w:rtl w:val="0"/>
+        </w:rPr>
       </w:r>
     </w:p>
     <w:p>
@@ -6382,18 +8432,329 @@
           <w:szCs w:val="26"/>
         </w:rPr>
       </w:pPr>
-      <w:bookmarkStart w:colFirst="0" w:colLast="0" w:name="_jnujxydtcjm2" w:id="18"/>
-      <w:bookmarkEnd w:id="18"/>
-      <w:r>
+      <w:bookmarkStart w:colFirst="0" w:colLast="0" w:name="_qe8l4cilt2gx" w:id="40"/>
+      <w:bookmarkEnd w:id="40"/>
+      <w:r>
+        <w:rPr>
+          <w:rtl w:val="0"/>
+        </w:rPr>
+      </w:r>
+    </w:p>
+    <w:p>
+      <w:pPr>
+        <w:pStyle w:val="Heading3"/>
+        <w:keepNext w:val="0"/>
+        <w:keepLines w:val="0"/>
+        <w:spacing w:before="280" w:lineRule="auto"/>
         <w:rPr>
           <w:b w:val="1"/>
           <w:bCs w:val="1"/>
           <w:color w:val="000000"/>
           <w:sz w:val="26"/>
           <w:szCs w:val="26"/>
+        </w:rPr>
+      </w:pPr>
+      <w:bookmarkStart w:colFirst="0" w:colLast="0" w:name="_943evqw1n8j2" w:id="41"/>
+      <w:bookmarkEnd w:id="41"/>
+      <w:r>
+        <w:rPr>
+          <w:rtl w:val="0"/>
+        </w:rPr>
+      </w:r>
+    </w:p>
+    <w:p>
+      <w:pPr>
+        <w:pStyle w:val="Heading3"/>
+        <w:keepNext w:val="0"/>
+        <w:keepLines w:val="0"/>
+        <w:spacing w:before="280" w:lineRule="auto"/>
+        <w:rPr>
+          <w:b w:val="1"/>
+          <w:bCs w:val="1"/>
+          <w:color w:val="000000"/>
+          <w:sz w:val="26"/>
+          <w:szCs w:val="26"/>
+        </w:rPr>
+      </w:pPr>
+      <w:bookmarkStart w:colFirst="0" w:colLast="0" w:name="_59aaq6lrlluw" w:id="42"/>
+      <w:bookmarkEnd w:id="42"/>
+      <w:r>
+        <w:rPr>
+          <w:rtl w:val="0"/>
+        </w:rPr>
+      </w:r>
+    </w:p>
+    <w:p>
+      <w:pPr>
+        <w:pStyle w:val="Heading3"/>
+        <w:keepNext w:val="0"/>
+        <w:keepLines w:val="0"/>
+        <w:spacing w:before="280" w:lineRule="auto"/>
+        <w:rPr>
+          <w:b w:val="1"/>
+          <w:bCs w:val="1"/>
+          <w:color w:val="000000"/>
+          <w:sz w:val="26"/>
+          <w:szCs w:val="26"/>
+        </w:rPr>
+      </w:pPr>
+      <w:bookmarkStart w:colFirst="0" w:colLast="0" w:name="_ixosotr1com0" w:id="43"/>
+      <w:bookmarkEnd w:id="43"/>
+      <w:r>
+        <w:rPr>
+          <w:rtl w:val="0"/>
+        </w:rPr>
+      </w:r>
+    </w:p>
+    <w:p>
+      <w:pPr>
+        <w:pStyle w:val="Heading3"/>
+        <w:keepNext w:val="0"/>
+        <w:keepLines w:val="0"/>
+        <w:spacing w:before="280" w:lineRule="auto"/>
+        <w:rPr>
+          <w:b w:val="1"/>
+          <w:bCs w:val="1"/>
+          <w:color w:val="000000"/>
+          <w:sz w:val="26"/>
+          <w:szCs w:val="26"/>
+        </w:rPr>
+      </w:pPr>
+      <w:bookmarkStart w:colFirst="0" w:colLast="0" w:name="_13cqfvvwozqo" w:id="44"/>
+      <w:bookmarkEnd w:id="44"/>
+      <w:r>
+        <w:rPr>
+          <w:rtl w:val="0"/>
+        </w:rPr>
+      </w:r>
+    </w:p>
+    <w:p>
+      <w:pPr>
+        <w:pStyle w:val="Heading3"/>
+        <w:keepNext w:val="0"/>
+        <w:keepLines w:val="0"/>
+        <w:spacing w:before="280" w:lineRule="auto"/>
+        <w:rPr>
+          <w:b w:val="1"/>
+          <w:bCs w:val="1"/>
+          <w:color w:val="000000"/>
+          <w:sz w:val="26"/>
+          <w:szCs w:val="26"/>
+        </w:rPr>
+      </w:pPr>
+      <w:bookmarkStart w:colFirst="0" w:colLast="0" w:name="_7wzir5v0qzvs" w:id="45"/>
+      <w:bookmarkEnd w:id="45"/>
+      <w:r>
+        <w:rPr>
+          <w:rtl w:val="0"/>
+        </w:rPr>
+      </w:r>
+    </w:p>
+    <w:p>
+      <w:pPr>
+        <w:pStyle w:val="Heading3"/>
+        <w:keepNext w:val="0"/>
+        <w:keepLines w:val="0"/>
+        <w:spacing w:before="280" w:lineRule="auto"/>
+        <w:rPr>
+          <w:b w:val="1"/>
+          <w:bCs w:val="1"/>
+          <w:color w:val="000000"/>
+          <w:sz w:val="26"/>
+          <w:szCs w:val="26"/>
+        </w:rPr>
+      </w:pPr>
+      <w:bookmarkStart w:colFirst="0" w:colLast="0" w:name="_2zml9120uqan" w:id="46"/>
+      <w:bookmarkEnd w:id="46"/>
+      <w:r>
+        <w:rPr>
+          <w:rtl w:val="0"/>
+        </w:rPr>
+      </w:r>
+    </w:p>
+    <w:p>
+      <w:pPr>
+        <w:pStyle w:val="Heading3"/>
+        <w:keepNext w:val="0"/>
+        <w:keepLines w:val="0"/>
+        <w:spacing w:before="280" w:lineRule="auto"/>
+        <w:rPr>
+          <w:b w:val="1"/>
+          <w:bCs w:val="1"/>
+          <w:color w:val="000000"/>
+          <w:sz w:val="26"/>
+          <w:szCs w:val="26"/>
+        </w:rPr>
+      </w:pPr>
+      <w:bookmarkStart w:colFirst="0" w:colLast="0" w:name="_645tmwz5atv2" w:id="47"/>
+      <w:bookmarkEnd w:id="47"/>
+      <w:r>
+        <w:rPr>
+          <w:rtl w:val="0"/>
+        </w:rPr>
+      </w:r>
+    </w:p>
+    <w:p>
+      <w:pPr>
+        <w:pStyle w:val="Heading3"/>
+        <w:keepNext w:val="0"/>
+        <w:keepLines w:val="0"/>
+        <w:spacing w:before="280" w:lineRule="auto"/>
+        <w:rPr>
+          <w:b w:val="1"/>
+          <w:bCs w:val="1"/>
+          <w:color w:val="000000"/>
+          <w:sz w:val="26"/>
+          <w:szCs w:val="26"/>
+        </w:rPr>
+      </w:pPr>
+      <w:bookmarkStart w:colFirst="0" w:colLast="0" w:name="_yv9xzy2n18nj" w:id="48"/>
+      <w:bookmarkEnd w:id="48"/>
+      <w:r>
+        <w:rPr>
+          <w:rtl w:val="0"/>
+        </w:rPr>
+      </w:r>
+    </w:p>
+    <w:p>
+      <w:pPr>
+        <w:pStyle w:val="Heading3"/>
+        <w:keepNext w:val="0"/>
+        <w:keepLines w:val="0"/>
+        <w:spacing w:before="280" w:lineRule="auto"/>
+        <w:rPr>
+          <w:b w:val="1"/>
+          <w:bCs w:val="1"/>
+          <w:color w:val="000000"/>
+          <w:sz w:val="26"/>
+          <w:szCs w:val="26"/>
+        </w:rPr>
+      </w:pPr>
+      <w:bookmarkStart w:colFirst="0" w:colLast="0" w:name="_4pyrq5ittdrw" w:id="49"/>
+      <w:bookmarkEnd w:id="49"/>
+      <w:r>
+        <w:rPr>
+          <w:rtl w:val="0"/>
+        </w:rPr>
+      </w:r>
+    </w:p>
+    <w:p>
+      <w:pPr>
+        <w:pStyle w:val="Heading3"/>
+        <w:keepNext w:val="0"/>
+        <w:keepLines w:val="0"/>
+        <w:spacing w:before="280" w:lineRule="auto"/>
+        <w:rPr>
+          <w:b w:val="1"/>
+          <w:bCs w:val="1"/>
+          <w:color w:val="000000"/>
+          <w:sz w:val="26"/>
+          <w:szCs w:val="26"/>
+        </w:rPr>
+      </w:pPr>
+      <w:bookmarkStart w:colFirst="0" w:colLast="0" w:name="_jnujxydtcjm2" w:id="50"/>
+      <w:bookmarkEnd w:id="50"/>
+      <w:r>
+        <w:rPr>
+          <w:b w:val="1"/>
+          <w:bCs w:val="1"/>
+          <w:color w:val="000000"/>
+          <w:sz w:val="26"/>
+          <w:szCs w:val="26"/>
           <w:rtl w:val="0"/>
         </w:rPr>
         <w:t xml:space="preserve">TC-018: Funkčnosť formulára v prehliadači Edge</w:t>
+      </w:r>
+    </w:p>
+    <w:p>
+      <w:pPr>
+        <w:rPr/>
+      </w:pPr>
+      <w:r>
+        <w:rPr>
+          <w:rtl w:val="0"/>
+        </w:rPr>
+      </w:r>
+    </w:p>
+    <w:p>
+      <w:pPr>
+        <w:rPr/>
+      </w:pPr>
+      <w:r>
+        <w:rPr>
+          <w:b w:val="1"/>
+          <w:bCs w:val="1"/>
+          <w:rtl w:val="0"/>
+        </w:rPr>
+        <w:t xml:space="preserve">Entry Criteria:</w:t>
+      </w:r>
+      <w:r>
+        <w:rPr>
+          <w:rtl w:val="0"/>
+        </w:rPr>
+        <w:t xml:space="preserve"> Web dostupný, Edge</w:t>
+      </w:r>
+    </w:p>
+    <w:p>
+      <w:pPr>
+        <w:rPr/>
+      </w:pPr>
+      <w:r>
+        <w:rPr>
+          <w:b w:val="1"/>
+          <w:bCs w:val="1"/>
+          <w:rtl w:val="0"/>
+        </w:rPr>
+        <w:t xml:space="preserve">Exit Criteria:</w:t>
+      </w:r>
+      <w:r>
+        <w:rPr>
+          <w:rtl w:val="0"/>
+        </w:rPr>
+        <w:t xml:space="preserve"> Formulár funguje ako v Chrome</w:t>
+      </w:r>
+    </w:p>
+    <w:p>
+      <w:pPr>
+        <w:rPr/>
+      </w:pPr>
+      <w:r>
+        <w:rPr>
+          <w:b w:val="1"/>
+          <w:bCs w:val="1"/>
+          <w:rtl w:val="0"/>
+        </w:rPr>
+        <w:t xml:space="preserve">Severity:</w:t>
+      </w:r>
+      <w:r>
+        <w:rPr>
+          <w:rtl w:val="0"/>
+        </w:rPr>
+        <w:t xml:space="preserve"> Medium</w:t>
+      </w:r>
+    </w:p>
+    <w:p>
+      <w:pPr>
+        <w:rPr/>
+      </w:pPr>
+      <w:r>
+        <w:rPr>
+          <w:b w:val="1"/>
+          <w:bCs w:val="1"/>
+          <w:rtl w:val="0"/>
+        </w:rPr>
+        <w:t xml:space="preserve">Priority:</w:t>
+      </w:r>
+      <w:r>
+        <w:rPr>
+          <w:rtl w:val="0"/>
+        </w:rPr>
+        <w:t xml:space="preserve"> Medium</w:t>
+      </w:r>
+      <w:r>
+        <w:rPr>
+          <w:rtl w:val="0"/>
+        </w:rPr>
       </w:r>
     </w:p>
     <w:p>
@@ -6653,8 +9014,8 @@
           <w:szCs w:val="26"/>
         </w:rPr>
       </w:pPr>
-      <w:bookmarkStart w:colFirst="0" w:colLast="0" w:name="_bp8ido1f4xwr" w:id="19"/>
-      <w:bookmarkEnd w:id="19"/>
+      <w:bookmarkStart w:colFirst="0" w:colLast="0" w:name="_bp8ido1f4xwr" w:id="51"/>
+      <w:bookmarkEnd w:id="51"/>
       <w:r>
         <w:rPr>
           <w:b w:val="1"/>
@@ -6665,6 +9026,97 @@
           <w:rtl w:val="0"/>
         </w:rPr>
         <w:t xml:space="preserve">TC-019: Navigácia cez button „Objednať" v sekcii O mne</w:t>
+      </w:r>
+    </w:p>
+    <w:p>
+      <w:pPr>
+        <w:rPr/>
+      </w:pPr>
+      <w:r>
+        <w:rPr>
+          <w:rtl w:val="0"/>
+        </w:rPr>
+      </w:r>
+    </w:p>
+    <w:p>
+      <w:pPr>
+        <w:rPr/>
+      </w:pPr>
+      <w:r>
+        <w:rPr>
+          <w:b w:val="1"/>
+          <w:bCs w:val="1"/>
+          <w:rtl w:val="0"/>
+        </w:rPr>
+        <w:t xml:space="preserve">Entry Criteria:</w:t>
+      </w:r>
+      <w:r>
+        <w:rPr>
+          <w:rtl w:val="0"/>
+        </w:rPr>
+        <w:t xml:space="preserve"> Web dostupný, sekcia O mne viditeľná</w:t>
+      </w:r>
+    </w:p>
+    <w:p>
+      <w:pPr>
+        <w:rPr/>
+      </w:pPr>
+      <w:r>
+        <w:rPr>
+          <w:b w:val="1"/>
+          <w:bCs w:val="1"/>
+          <w:rtl w:val="0"/>
+        </w:rPr>
+        <w:t xml:space="preserve">Exit Criteria:</w:t>
+      </w:r>
+      <w:r>
+        <w:rPr>
+          <w:rtl w:val="0"/>
+        </w:rPr>
+        <w:t xml:space="preserve"> Formulár viditeľný po scrollnutí</w:t>
+      </w:r>
+    </w:p>
+    <w:p>
+      <w:pPr>
+        <w:rPr/>
+      </w:pPr>
+      <w:r>
+        <w:rPr>
+          <w:b w:val="1"/>
+          <w:bCs w:val="1"/>
+          <w:rtl w:val="0"/>
+        </w:rPr>
+        <w:t xml:space="preserve">Severity:</w:t>
+      </w:r>
+      <w:r>
+        <w:rPr>
+          <w:rtl w:val="0"/>
+        </w:rPr>
+        <w:t xml:space="preserve"> Low</w:t>
+      </w:r>
+    </w:p>
+    <w:p>
+      <w:pPr>
+        <w:rPr/>
+      </w:pPr>
+      <w:r>
+        <w:rPr>
+          <w:b w:val="1"/>
+          <w:bCs w:val="1"/>
+          <w:rtl w:val="0"/>
+        </w:rPr>
+        <w:t xml:space="preserve">Priority:</w:t>
+      </w:r>
+      <w:r>
+        <w:rPr>
+          <w:rtl w:val="0"/>
+        </w:rPr>
+        <w:t xml:space="preserve"> Low</w:t>
+      </w:r>
+      <w:r>
+        <w:rPr>
+          <w:rtl w:val="0"/>
+        </w:rPr>
       </w:r>
     </w:p>
     <w:p>
@@ -6923,18 +9375,285 @@
           <w:szCs w:val="26"/>
         </w:rPr>
       </w:pPr>
-      <w:bookmarkStart w:colFirst="0" w:colLast="0" w:name="_ecciuevv6ry1" w:id="20"/>
-      <w:bookmarkEnd w:id="20"/>
-      <w:r>
+      <w:bookmarkStart w:colFirst="0" w:colLast="0" w:name="_ennixzszojhk" w:id="52"/>
+      <w:bookmarkEnd w:id="52"/>
+      <w:r>
+        <w:rPr>
+          <w:rtl w:val="0"/>
+        </w:rPr>
+      </w:r>
+    </w:p>
+    <w:p>
+      <w:pPr>
+        <w:pStyle w:val="Heading3"/>
+        <w:keepNext w:val="0"/>
+        <w:keepLines w:val="0"/>
+        <w:spacing w:before="280" w:lineRule="auto"/>
         <w:rPr>
           <w:b w:val="1"/>
           <w:bCs w:val="1"/>
           <w:color w:val="000000"/>
           <w:sz w:val="26"/>
           <w:szCs w:val="26"/>
+        </w:rPr>
+      </w:pPr>
+      <w:bookmarkStart w:colFirst="0" w:colLast="0" w:name="_2lnoexwt6p5" w:id="53"/>
+      <w:bookmarkEnd w:id="53"/>
+      <w:r>
+        <w:rPr>
+          <w:rtl w:val="0"/>
+        </w:rPr>
+      </w:r>
+    </w:p>
+    <w:p>
+      <w:pPr>
+        <w:pStyle w:val="Heading3"/>
+        <w:keepNext w:val="0"/>
+        <w:keepLines w:val="0"/>
+        <w:spacing w:before="280" w:lineRule="auto"/>
+        <w:rPr>
+          <w:b w:val="1"/>
+          <w:bCs w:val="1"/>
+          <w:color w:val="000000"/>
+          <w:sz w:val="26"/>
+          <w:szCs w:val="26"/>
+        </w:rPr>
+      </w:pPr>
+      <w:bookmarkStart w:colFirst="0" w:colLast="0" w:name="_n2d2g9lnxqla" w:id="54"/>
+      <w:bookmarkEnd w:id="54"/>
+      <w:r>
+        <w:rPr>
+          <w:rtl w:val="0"/>
+        </w:rPr>
+      </w:r>
+    </w:p>
+    <w:p>
+      <w:pPr>
+        <w:pStyle w:val="Heading3"/>
+        <w:keepNext w:val="0"/>
+        <w:keepLines w:val="0"/>
+        <w:spacing w:before="280" w:lineRule="auto"/>
+        <w:rPr>
+          <w:b w:val="1"/>
+          <w:bCs w:val="1"/>
+          <w:color w:val="000000"/>
+          <w:sz w:val="26"/>
+          <w:szCs w:val="26"/>
+        </w:rPr>
+      </w:pPr>
+      <w:bookmarkStart w:colFirst="0" w:colLast="0" w:name="_wxtxd4p15u3z" w:id="55"/>
+      <w:bookmarkEnd w:id="55"/>
+      <w:r>
+        <w:rPr>
+          <w:rtl w:val="0"/>
+        </w:rPr>
+      </w:r>
+    </w:p>
+    <w:p>
+      <w:pPr>
+        <w:pStyle w:val="Heading3"/>
+        <w:keepNext w:val="0"/>
+        <w:keepLines w:val="0"/>
+        <w:spacing w:before="280" w:lineRule="auto"/>
+        <w:rPr>
+          <w:b w:val="1"/>
+          <w:bCs w:val="1"/>
+          <w:color w:val="000000"/>
+          <w:sz w:val="26"/>
+          <w:szCs w:val="26"/>
+        </w:rPr>
+      </w:pPr>
+      <w:bookmarkStart w:colFirst="0" w:colLast="0" w:name="_m7exthmdqmx5" w:id="56"/>
+      <w:bookmarkEnd w:id="56"/>
+      <w:r>
+        <w:rPr>
+          <w:rtl w:val="0"/>
+        </w:rPr>
+      </w:r>
+    </w:p>
+    <w:p>
+      <w:pPr>
+        <w:pStyle w:val="Heading3"/>
+        <w:keepNext w:val="0"/>
+        <w:keepLines w:val="0"/>
+        <w:spacing w:before="280" w:lineRule="auto"/>
+        <w:rPr>
+          <w:b w:val="1"/>
+          <w:bCs w:val="1"/>
+          <w:color w:val="000000"/>
+          <w:sz w:val="26"/>
+          <w:szCs w:val="26"/>
+        </w:rPr>
+      </w:pPr>
+      <w:bookmarkStart w:colFirst="0" w:colLast="0" w:name="_hf6s7c7fsbqt" w:id="57"/>
+      <w:bookmarkEnd w:id="57"/>
+      <w:r>
+        <w:rPr>
+          <w:rtl w:val="0"/>
+        </w:rPr>
+      </w:r>
+    </w:p>
+    <w:p>
+      <w:pPr>
+        <w:pStyle w:val="Heading3"/>
+        <w:keepNext w:val="0"/>
+        <w:keepLines w:val="0"/>
+        <w:spacing w:before="280" w:lineRule="auto"/>
+        <w:rPr>
+          <w:b w:val="1"/>
+          <w:bCs w:val="1"/>
+          <w:color w:val="000000"/>
+          <w:sz w:val="26"/>
+          <w:szCs w:val="26"/>
+        </w:rPr>
+      </w:pPr>
+      <w:bookmarkStart w:colFirst="0" w:colLast="0" w:name="_d4b71ni0wunb" w:id="58"/>
+      <w:bookmarkEnd w:id="58"/>
+      <w:r>
+        <w:rPr>
+          <w:rtl w:val="0"/>
+        </w:rPr>
+      </w:r>
+    </w:p>
+    <w:p>
+      <w:pPr>
+        <w:pStyle w:val="Heading3"/>
+        <w:keepNext w:val="0"/>
+        <w:keepLines w:val="0"/>
+        <w:spacing w:before="280" w:lineRule="auto"/>
+        <w:rPr>
+          <w:b w:val="1"/>
+          <w:bCs w:val="1"/>
+          <w:color w:val="000000"/>
+          <w:sz w:val="26"/>
+          <w:szCs w:val="26"/>
+        </w:rPr>
+      </w:pPr>
+      <w:bookmarkStart w:colFirst="0" w:colLast="0" w:name="_e55plnxxo641" w:id="59"/>
+      <w:bookmarkEnd w:id="59"/>
+      <w:r>
+        <w:rPr>
+          <w:rtl w:val="0"/>
+        </w:rPr>
+      </w:r>
+    </w:p>
+    <w:p>
+      <w:pPr>
+        <w:pStyle w:val="Heading3"/>
+        <w:keepNext w:val="0"/>
+        <w:keepLines w:val="0"/>
+        <w:spacing w:before="280" w:lineRule="auto"/>
+        <w:rPr>
+          <w:b w:val="1"/>
+          <w:bCs w:val="1"/>
+          <w:color w:val="000000"/>
+          <w:sz w:val="26"/>
+          <w:szCs w:val="26"/>
+        </w:rPr>
+      </w:pPr>
+      <w:bookmarkStart w:colFirst="0" w:colLast="0" w:name="_ecciuevv6ry1" w:id="60"/>
+      <w:bookmarkEnd w:id="60"/>
+      <w:r>
+        <w:rPr>
+          <w:b w:val="1"/>
+          <w:bCs w:val="1"/>
+          <w:color w:val="000000"/>
+          <w:sz w:val="26"/>
+          <w:szCs w:val="26"/>
           <w:rtl w:val="0"/>
         </w:rPr>
         <w:t xml:space="preserve">TC-020: Výkon formulára - čas odozvy pri odoslaní</w:t>
+      </w:r>
+    </w:p>
+    <w:p>
+      <w:pPr>
+        <w:rPr/>
+      </w:pPr>
+      <w:r>
+        <w:rPr>
+          <w:rtl w:val="0"/>
+        </w:rPr>
+      </w:r>
+    </w:p>
+    <w:p>
+      <w:pPr>
+        <w:rPr/>
+      </w:pPr>
+      <w:r>
+        <w:rPr>
+          <w:b w:val="1"/>
+          <w:bCs w:val="1"/>
+          <w:rtl w:val="0"/>
+        </w:rPr>
+        <w:t xml:space="preserve">Entry Criteria:</w:t>
+      </w:r>
+      <w:r>
+        <w:rPr>
+          <w:rtl w:val="0"/>
+        </w:rPr>
+        <w:t xml:space="preserve"> Formulár dostupný, stabilné pripojenie</w:t>
+      </w:r>
+    </w:p>
+    <w:p>
+      <w:pPr>
+        <w:rPr/>
+      </w:pPr>
+      <w:r>
+        <w:rPr>
+          <w:b w:val="1"/>
+          <w:bCs w:val="1"/>
+          <w:rtl w:val="0"/>
+        </w:rPr>
+        <w:t xml:space="preserve">Exit Criteria:</w:t>
+      </w:r>
+      <w:r>
+        <w:rPr>
+          <w:rtl w:val="0"/>
+        </w:rPr>
+        <w:t xml:space="preserve"> Success popup sa zobrazí do 1 sekundy</w:t>
+      </w:r>
+    </w:p>
+    <w:p>
+      <w:pPr>
+        <w:rPr/>
+      </w:pPr>
+      <w:r>
+        <w:rPr>
+          <w:b w:val="1"/>
+          <w:bCs w:val="1"/>
+          <w:rtl w:val="0"/>
+        </w:rPr>
+        <w:t xml:space="preserve">Severity:</w:t>
+      </w:r>
+      <w:r>
+        <w:rPr>
+          <w:rtl w:val="0"/>
+        </w:rPr>
+        <w:t xml:space="preserve"> Medium</w:t>
+      </w:r>
+    </w:p>
+    <w:p>
+      <w:pPr>
+        <w:rPr/>
+      </w:pPr>
+      <w:r>
+        <w:rPr>
+          <w:b w:val="1"/>
+          <w:bCs w:val="1"/>
+          <w:rtl w:val="0"/>
+        </w:rPr>
+        <w:t xml:space="preserve">Priority:</w:t>
+      </w:r>
+      <w:r>
+        <w:rPr>
+          <w:rtl w:val="0"/>
+        </w:rPr>
+        <w:t xml:space="preserve"> Medium</w:t>
+      </w:r>
+      <w:r>
+        <w:rPr>
+          <w:rtl w:val="0"/>
+        </w:rPr>
       </w:r>
     </w:p>
     <w:p>

</xml_diff>